<commit_message>
Etkinlige yonlendiren 'kesfediniz' cumlelerine eksik nesne eklendi (1.8 ve 2.1-2.9)
</commit_message>
<xml_diff>
--- a/Kim11-1-8-Hiz-Denkleminin-Belirlenmesi.docx
+++ b/Kim11-1-8-Hiz-Denkleminin-Belirlenmesi.docx
@@ -39,147 +39,239 @@
           <w:rFonts w:ascii="Times New Roman" w:hAnsi="Times New Roman" w:cs="Times New Roman"/>
           <w:lang w:val="tr-TR"/>
         </w:rPr>
-        <w:t xml:space="preserve">Şehirlerde trafiğin yoğun olduğu saatlerde araç egzozlarından çıkan azot monoksit (NO) gazı, havadaki oksijenle tepkimeye girerek kırmızımsı kahverengi renkli azot dioksit (NO</w:t>
-      </w:r>
-      <w:r>
-        <w:rPr>
-          <w:rFonts w:ascii="Times New Roman" w:hAnsi="Times New Roman" w:cs="Times New Roman"/>
-          <w:lang w:val="tr-TR"/>
+        <w:t>Şehirlerde trafiğin yoğun olduğu saatlerde araç egzozlarından çıkan azot monoksit (NO) gazı, havadaki oksijenle tepkimeye girerek kırmızımsı kahverengi renkli azot dioksit (NO</w:t>
+      </w:r>
+      <w:r>
+        <w:rPr>
+          <w:rFonts w:ascii="Times New Roman" w:hAnsi="Times New Roman" w:cs="Times New Roman"/>
           <w:vertAlign w:val="subscript"/>
-        </w:rPr>
-        <w:t xml:space="preserve">2</w:t>
-      </w:r>
-      <w:r>
-        <w:rPr>
-          <w:rFonts w:ascii="Times New Roman" w:hAnsi="Times New Roman" w:cs="Times New Roman"/>
-          <w:lang w:val="tr-TR"/>
-        </w:rPr>
-        <w:t xml:space="preserve">) gazına dönüşür. Büyük şehirlerin üzerinde zaman zaman görülen kahverengimsi hava kirliliği tabakasının (Görsel A) oluşmasında bu tepkimenin önemli bir payı vardır. Hava kalitesini izleyen bilim insanları, NO gazının derişimi iki katına çıktığında NO</w:t>
-      </w:r>
-      <w:r>
-        <w:rPr>
-          <w:rFonts w:ascii="Times New Roman" w:hAnsi="Times New Roman" w:cs="Times New Roman"/>
-          <w:lang w:val="tr-TR"/>
+          <w:lang w:val="tr-TR"/>
+        </w:rPr>
+        <w:t>2</w:t>
+      </w:r>
+      <w:r>
+        <w:rPr>
+          <w:rFonts w:ascii="Times New Roman" w:hAnsi="Times New Roman" w:cs="Times New Roman"/>
+          <w:lang w:val="tr-TR"/>
+        </w:rPr>
+        <w:t>) gazına dönüşür. Büyük şehirlerin üzerinde zaman zaman görülen kahverengimsi hava kirliliği tabakasının (Görsel A) oluşmasında bu tepkimenin önemli bir payı vardır. Hava kalitesini izleyen bilim insanları, NO gazının derişimi iki katına çıktığında NO</w:t>
+      </w:r>
+      <w:r>
+        <w:rPr>
+          <w:rFonts w:ascii="Times New Roman" w:hAnsi="Times New Roman" w:cs="Times New Roman"/>
           <w:vertAlign w:val="subscript"/>
-        </w:rPr>
-        <w:t xml:space="preserve">2</w:t>
-      </w:r>
-      <w:r>
-        <w:rPr>
-          <w:rFonts w:ascii="Times New Roman" w:hAnsi="Times New Roman" w:cs="Times New Roman"/>
-          <w:lang w:val="tr-TR"/>
-        </w:rPr>
-        <w:t xml:space="preserve"> oluşma hızının nasıl değişeceğini tahmin edebilmek için tepken derişimleri ile tepkime hızı arasındaki ilişkiyi bilmek ister. Önceki konuda tepken derişimi arttıkça tepkime hızının arttığını öğrendiniz. Peki bu artış nicel olarak nasıl ifade edilebilir? Tepken derişimi iki katına çıktığında tepkime hızı da her zaman iki katına mı çıkar? Analiz ve Keşif Atölyesi 1.8.’deki etkinliği yaparak keşfediniz. Bu etkinlikte hazır deney verilerini inceleyerek tepken derişimlerindeki değişimin tepkime hızına etkisini matematiksel olarak modelleyecek ve kurduğunuz modelden yararlanarak bilimsel veriye dayalı tahminlerde bulunacaksınız. Tahminlerinizi ölçülen değerlerle karşılaştırıp kendi çıkarımlarınızı eleştirel bir gözle değerlendirirken veri okuma ve yorumlama becerilerinizi de güçlendireceksiniz.</w:t>
-      </w:r>
-    </w:p>
-    <w:tbl>
-      <w:tblPr>
-        <w:tblW w:w="9000" w:type="dxa"/>
-        <w:jc w:val="center"/>
-        <w:tblBorders>
-          <w:top w:val="single" w:sz="8" w:space="0" w:color="7F7F7F"/>
-          <w:left w:val="single" w:sz="8" w:space="0" w:color="7F7F7F"/>
-          <w:bottom w:val="single" w:sz="8" w:space="0" w:color="7F7F7F"/>
-          <w:right w:val="single" w:sz="8" w:space="0" w:color="7F7F7F"/>
-        </w:tblBorders>
-        <w:tblLook w:val="04A0" w:firstRow="1" w:lastRow="0" w:firstColumn="1" w:lastColumn="0" w:noHBand="0" w:noVBand="1"/>
-      </w:tblPr>
-      <w:tblGrid>
-        <w:gridCol w:w="9000"/>
-      </w:tblGrid>
-      <w:tr>
-        <w:trPr>
-          <w:jc w:val="center"/>
-        </w:trPr>
-        <w:tc>
-          <w:tcPr>
-            <w:tcW w:w="9000" w:type="dxa"/>
-            <w:shd w:val="clear" w:color="auto" w:fill="EDEDED"/>
-          </w:tcPr>
-          <w:p>
-            <w:pPr>
-              <w:jc w:val="both"/>
-              <w:rPr>
-                <w:rFonts w:ascii="Times New Roman" w:hAnsi="Times New Roman" w:cs="Times New Roman"/>
-                <w:lang w:val="tr-TR"/>
-              </w:rPr>
-            </w:pPr>
-            <w:r>
-              <w:rPr>
-                <w:rFonts w:ascii="Times New Roman" w:hAnsi="Times New Roman" w:cs="Times New Roman"/>
-                <w:lang w:val="tr-TR"/>
-              </w:rPr>
-              <w:t>GÖRSEL ALANI (Shutterstock)</w:t>
-            </w:r>
-          </w:p>
-          <w:p>
-            <w:pPr>
-              <w:jc w:val="both"/>
-              <w:rPr>
-                <w:rFonts w:ascii="Times New Roman" w:hAnsi="Times New Roman" w:cs="Times New Roman"/>
-                <w:lang w:val="tr-TR"/>
-              </w:rPr>
-            </w:pPr>
-            <w:r>
-              <w:rPr>
-                <w:rFonts w:ascii="Times New Roman" w:hAnsi="Times New Roman" w:cs="Times New Roman"/>
-                <w:lang w:val="tr-TR"/>
-              </w:rPr>
-              <w:t>Tarif: Büyük bir şehrin silüeti üzerinde kahverengimsi/sarımsı bir sis-duman (smog) tabakası; mümkünse yurt içinden genel bir şehir görüntüsü.</w:t>
-            </w:r>
-          </w:p>
-          <w:p>
-            <w:pPr>
-              <w:jc w:val="both"/>
-              <w:rPr>
-                <w:rFonts w:ascii="Times New Roman" w:hAnsi="Times New Roman" w:cs="Times New Roman"/>
-                <w:lang w:val="tr-TR"/>
-              </w:rPr>
-            </w:pPr>
-            <w:r>
-              <w:rPr>
-                <w:rFonts w:ascii="Times New Roman" w:hAnsi="Times New Roman" w:cs="Times New Roman"/>
-                <w:lang w:val="tr-TR"/>
-              </w:rPr>
-              <w:t>Shutter ID: 2681073429 (fotoğraf) — City skyline covered in heavy smog</w:t>
-            </w:r>
-          </w:p>
-        </w:tc>
-      </w:tr>
-    </w:tbl>
-    <w:p>
-      <w:pPr>
-        <w:jc w:val="both"/>
-        <w:rPr>
-          <w:rFonts w:ascii="Times New Roman" w:hAnsi="Times New Roman" w:cs="Times New Roman"/>
-          <w:lang w:val="tr-TR"/>
-        </w:rPr>
-      </w:pPr>
-    </w:p>
-    <w:p>
-      <w:pPr>
-        <w:jc w:val="both"/>
-        <w:rPr>
-          <w:rFonts w:ascii="Times New Roman" w:hAnsi="Times New Roman" w:cs="Times New Roman"/>
-          <w:lang w:val="tr-TR"/>
-        </w:rPr>
-      </w:pPr>
-    </w:p>
-    <w:p>
-      <w:pPr>
-        <w:jc w:val="center"/>
-        <w:rPr>
-          <w:rFonts w:ascii="Times New Roman" w:hAnsi="Times New Roman" w:cs="Times New Roman"/>
-          <w:lang w:val="tr-TR"/>
-        </w:rPr>
-      </w:pPr>
-      <w:r>
+          <w:lang w:val="tr-TR"/>
+        </w:rPr>
+        <w:t>2</w:t>
+      </w:r>
+      <w:r>
+        <w:rPr>
+          <w:rFonts w:ascii="Times New Roman" w:hAnsi="Times New Roman" w:cs="Times New Roman"/>
+          <w:lang w:val="tr-TR"/>
+        </w:rPr>
+        <w:t xml:space="preserve"> oluşma hızının nasıl değişeceğini tahmin edebilmek için tepken derişimleri ile tepkime hızı arasındaki ilişkiyi bilmek ister. Önceki konuda tepken derişimi arttıkça tepkime hızının arttığını öğrendiniz. Peki bu artış nicel olarak nasıl ifade edilebilir? Tepken derişimi iki katına çıktığında tepkime hızı da her zaman iki katına mı çıkar? Bu soruların cevabını Analiz ve Keşif Atölyesi 1.8.’deki etkinliği yaparak keşfediniz. Bu etkinlikte hazır deney verilerini inceleyerek tepken derişimlerindeki değişimin tepkime hızına etkisini matematiksel olarak modelleyecek ve kurduğunuz modelden yararlanarak bilimsel veriye dayalı tahminlerde bulunacaksınız. Tahminlerinizi ölçülen değerlerle karşılaştırıp kendi çıkarımlarınızı eleştirel bir gözle değerlendirirken veri okuma ve yorumlama becerilerinizi de güçlendireceksiniz.</w:t>
+      </w:r>
+    </w:p>
+    <w:p>
+      <w:pPr>
+        <w:jc w:val="both"/>
+        <w:rPr>
+          <w:rFonts w:ascii="Times New Roman" w:hAnsi="Times New Roman" w:cs="Times New Roman"/>
+          <w:lang w:val="tr-TR"/>
+        </w:rPr>
+      </w:pPr>
+      <w:r>
+        <w:fldChar w:fldCharType="begin"/>
+      </w:r>
+      <w:r>
+        <w:instrText xml:space="preserve"> INCLUDEPICTURE "https://www.shutterstock.com/shutterstock/photos/2681073429/display_1500/stock-photo-city-skyline-covered-in-heavy-smog-and-air-pollution-showing-urban-buildings-obscured-by-haze-2681073429.jpg" \* MERGEFORMATINET </w:instrText>
+      </w:r>
+      <w:r>
+        <w:fldChar w:fldCharType="separate"/>
+      </w:r>
+      <w:r>
+        <w:rPr>
+          <w:noProof/>
+        </w:rPr>
+        <w:drawing>
+          <wp:inline distT="0" distB="0" distL="0" distR="0" wp14:anchorId="08E1D8CA" wp14:editId="0B1E1EFB">
+            <wp:extent cx="5943600" cy="4358640"/>
+            <wp:effectExtent l="0" t="0" r="0" b="0"/>
+            <wp:docPr id="725839212" name="Picture 9" descr="City skyline covered in heavy smog and air pollution, showing urban buildings obscured by haze. Concept of environmental issues, poor air quality, climate change, and health problems."/>
+            <wp:cNvGraphicFramePr>
+              <a:graphicFrameLocks xmlns:a="http://schemas.openxmlformats.org/drawingml/2006/main" noChangeAspect="1"/>
+            </wp:cNvGraphicFramePr>
+            <a:graphic xmlns:a="http://schemas.openxmlformats.org/drawingml/2006/main">
+              <a:graphicData uri="http://schemas.openxmlformats.org/drawingml/2006/picture">
+                <pic:pic xmlns:pic="http://schemas.openxmlformats.org/drawingml/2006/picture">
+                  <pic:nvPicPr>
+                    <pic:cNvPr id="0" name="Picture 1" descr="City skyline covered in heavy smog and air pollution, showing urban buildings obscured by haze. Concept of environmental issues, poor air quality, climate change, and health problems."/>
+                    <pic:cNvPicPr>
+                      <a:picLocks noChangeAspect="1" noChangeArrowheads="1"/>
+                    </pic:cNvPicPr>
+                  </pic:nvPicPr>
+                  <pic:blipFill>
+                    <a:blip r:embed="rId7" cstate="print">
+                      <a:extLst>
+                        <a:ext uri="{28A0092B-C50C-407E-A947-70E740481C1C}">
+                          <a14:useLocalDpi xmlns:a14="http://schemas.microsoft.com/office/drawing/2010/main" val="0"/>
+                        </a:ext>
+                      </a:extLst>
+                    </a:blip>
+                    <a:srcRect/>
+                    <a:stretch>
+                      <a:fillRect/>
+                    </a:stretch>
+                  </pic:blipFill>
+                  <pic:spPr bwMode="auto">
+                    <a:xfrm>
+                      <a:off x="0" y="0"/>
+                      <a:ext cx="5943600" cy="4358640"/>
+                    </a:xfrm>
+                    <a:prstGeom prst="rect">
+                      <a:avLst/>
+                    </a:prstGeom>
+                    <a:noFill/>
+                    <a:ln>
+                      <a:noFill/>
+                    </a:ln>
+                  </pic:spPr>
+                </pic:pic>
+              </a:graphicData>
+            </a:graphic>
+          </wp:inline>
+        </w:drawing>
+      </w:r>
+      <w:r>
+        <w:fldChar w:fldCharType="end"/>
+      </w:r>
+    </w:p>
+    <w:p>
+      <w:pPr>
+        <w:jc w:val="both"/>
         <w:rPr>
           <w:rFonts w:ascii="Times New Roman" w:hAnsi="Times New Roman" w:cs="Times New Roman"/>
           <w:b/>
           <w:bCs/>
           <w:lang w:val="tr-TR"/>
         </w:rPr>
+      </w:pPr>
+      <w:proofErr w:type="spellStart"/>
+      <w:r>
+        <w:rPr>
+          <w:rFonts w:ascii="Times New Roman" w:hAnsi="Times New Roman" w:cs="Times New Roman"/>
+          <w:b/>
+          <w:bCs/>
+          <w:highlight w:val="yellow"/>
+          <w:lang w:val="tr-TR"/>
+        </w:rPr>
+        <w:t>Shutter</w:t>
+      </w:r>
+      <w:proofErr w:type="spellEnd"/>
+      <w:r>
+        <w:rPr>
+          <w:rFonts w:ascii="Times New Roman" w:hAnsi="Times New Roman" w:cs="Times New Roman"/>
+          <w:b/>
+          <w:bCs/>
+          <w:highlight w:val="yellow"/>
+          <w:lang w:val="tr-TR"/>
+        </w:rPr>
+        <w:t xml:space="preserve"> ID: 2681073429 (fotoğraf) — City </w:t>
+      </w:r>
+      <w:proofErr w:type="spellStart"/>
+      <w:r>
+        <w:rPr>
+          <w:rFonts w:ascii="Times New Roman" w:hAnsi="Times New Roman" w:cs="Times New Roman"/>
+          <w:b/>
+          <w:bCs/>
+          <w:highlight w:val="yellow"/>
+          <w:lang w:val="tr-TR"/>
+        </w:rPr>
+        <w:t>skyline</w:t>
+      </w:r>
+      <w:proofErr w:type="spellEnd"/>
+      <w:r>
+        <w:rPr>
+          <w:rFonts w:ascii="Times New Roman" w:hAnsi="Times New Roman" w:cs="Times New Roman"/>
+          <w:b/>
+          <w:bCs/>
+          <w:highlight w:val="yellow"/>
+          <w:lang w:val="tr-TR"/>
+        </w:rPr>
+        <w:t xml:space="preserve"> </w:t>
+      </w:r>
+      <w:proofErr w:type="spellStart"/>
+      <w:r>
+        <w:rPr>
+          <w:rFonts w:ascii="Times New Roman" w:hAnsi="Times New Roman" w:cs="Times New Roman"/>
+          <w:b/>
+          <w:bCs/>
+          <w:highlight w:val="yellow"/>
+          <w:lang w:val="tr-TR"/>
+        </w:rPr>
+        <w:t>covered</w:t>
+      </w:r>
+      <w:proofErr w:type="spellEnd"/>
+      <w:r>
+        <w:rPr>
+          <w:rFonts w:ascii="Times New Roman" w:hAnsi="Times New Roman" w:cs="Times New Roman"/>
+          <w:b/>
+          <w:bCs/>
+          <w:highlight w:val="yellow"/>
+          <w:lang w:val="tr-TR"/>
+        </w:rPr>
+        <w:t xml:space="preserve"> in </w:t>
+      </w:r>
+      <w:proofErr w:type="spellStart"/>
+      <w:r>
+        <w:rPr>
+          <w:rFonts w:ascii="Times New Roman" w:hAnsi="Times New Roman" w:cs="Times New Roman"/>
+          <w:b/>
+          <w:bCs/>
+          <w:highlight w:val="yellow"/>
+          <w:lang w:val="tr-TR"/>
+        </w:rPr>
+        <w:t>heavy</w:t>
+      </w:r>
+      <w:proofErr w:type="spellEnd"/>
+      <w:r>
+        <w:rPr>
+          <w:rFonts w:ascii="Times New Roman" w:hAnsi="Times New Roman" w:cs="Times New Roman"/>
+          <w:b/>
+          <w:bCs/>
+          <w:highlight w:val="yellow"/>
+          <w:lang w:val="tr-TR"/>
+        </w:rPr>
+        <w:t xml:space="preserve"> </w:t>
+      </w:r>
+      <w:proofErr w:type="spellStart"/>
+      <w:r>
+        <w:rPr>
+          <w:rFonts w:ascii="Times New Roman" w:hAnsi="Times New Roman" w:cs="Times New Roman"/>
+          <w:b/>
+          <w:bCs/>
+          <w:highlight w:val="yellow"/>
+          <w:lang w:val="tr-TR"/>
+        </w:rPr>
+        <w:t>smog</w:t>
+      </w:r>
+      <w:proofErr w:type="spellEnd"/>
+    </w:p>
+    <w:p>
+      <w:pPr>
+        <w:jc w:val="center"/>
+        <w:rPr>
+          <w:rFonts w:ascii="Times New Roman" w:hAnsi="Times New Roman" w:cs="Times New Roman"/>
+          <w:lang w:val="tr-TR"/>
+        </w:rPr>
+      </w:pPr>
+      <w:r>
+        <w:rPr>
+          <w:rFonts w:ascii="Times New Roman" w:hAnsi="Times New Roman" w:cs="Times New Roman"/>
+          <w:b/>
+          <w:bCs/>
+          <w:lang w:val="tr-TR"/>
+        </w:rPr>
         <w:t>Görsel A:</w:t>
       </w:r>
       <w:r>
@@ -209,6 +301,7 @@
           <w:bCs/>
           <w:lang w:val="tr-TR"/>
         </w:rPr>
+        <w:lastRenderedPageBreak/>
         <w:t>Analiz ve Keşif Atölyesi 1.8.</w:t>
       </w:r>
     </w:p>
@@ -861,7 +954,6 @@
           <w:rFonts w:ascii="Times New Roman" w:hAnsi="Times New Roman" w:cs="Times New Roman"/>
           <w:lang w:val="tr-TR"/>
         </w:rPr>
-        <w:lastRenderedPageBreak/>
         <w:t>Tablodaki verileri inceleyerek tepken derişimlerinin tepkime hızına etkisine ilişkin önermeler oluşturunuz.</w:t>
       </w:r>
     </w:p>
@@ -917,7 +1009,7 @@
           <w:rFonts w:ascii="Times New Roman" w:hAnsi="Times New Roman" w:cs="Times New Roman"/>
           <w:lang w:val="tr-TR"/>
         </w:rPr>
-        <w:t xml:space="preserve">Tepken derişiminin tepkime hızına etkisine ilişkin veriye dayalı olarak oluşturduğunuz önermeleri, tepkime hızına ilişkin ön bilgilerinizden hareketle oluşturduğunuz (veriye dayalı olmayan) önermelerle karşılaştırınız. Hangi önermelerinizin verilerle desteklendiğini, hangilerinin desteklenmediğini belirtiniz.</w:t>
+        <w:t>Tepken derişiminin tepkime hızına etkisine ilişkin veriye dayalı olarak oluşturduğunuz önermeleri, tepkime hızına ilişkin ön bilgilerinizden hareketle oluşturduğunuz (veriye dayalı olmayan) önermelerle karşılaştırınız. Hangi önermelerinizin verilerle desteklendiğini, hangilerinin desteklenmediğini belirtiniz.</w:t>
       </w:r>
     </w:p>
     <w:p>
@@ -1089,6 +1181,7 @@
           <w:rFonts w:ascii="Times New Roman" w:hAnsi="Times New Roman" w:cs="Times New Roman"/>
           <w:lang w:val="tr-TR"/>
         </w:rPr>
+        <w:lastRenderedPageBreak/>
         <w:t>……………………………………………………………………………………………</w:t>
       </w:r>
     </w:p>
@@ -1294,7 +1387,7 @@
                 <w:rFonts w:ascii="Times New Roman" w:hAnsi="Times New Roman" w:cs="Times New Roman"/>
                 <w:lang w:val="tr-TR"/>
               </w:rPr>
-              <w:t xml:space="preserve">Burada r tepkime hızı, k ise hız sabiti adı verilen orantı sabitidir. x ve y üsleri deneysel verilerden belirlenir; x tepkimenin A’ya göre, y ise B’ye göre derecesidir. Üslerin toplamı (x + y) toplam tepkime derecesi olarak adlandırılır.</w:t>
+              <w:t>Burada r tepkime hızı, k ise hız sabiti adı verilen orantı sabitidir. x ve y üsleri deneysel verilerden belirlenir; x tepkimenin A’ya göre, y ise B’ye göre derecesidir. Üslerin toplamı (x + y) toplam tepkime derecesi olarak adlandırılır.</w:t>
             </w:r>
           </w:p>
         </w:tc>
@@ -1382,7 +1475,6 @@
           <w:rFonts w:ascii="Times New Roman" w:hAnsi="Times New Roman" w:cs="Times New Roman"/>
           <w:lang w:val="tr-TR"/>
         </w:rPr>
-        <w:lastRenderedPageBreak/>
         <w:t>Deney 1’in verilerini kullanarak hız sabitinin (k) değerini ve birimini hesaplayınız.</w:t>
       </w:r>
     </w:p>
@@ -1438,7 +1530,7 @@
           <w:rFonts w:ascii="Times New Roman" w:hAnsi="Times New Roman" w:cs="Times New Roman"/>
           <w:lang w:val="tr-TR"/>
         </w:rPr>
-        <w:t xml:space="preserve">Belirlediğiniz hız denklemini kullanarak Deney 4’teki tepkime hızını tahmin ediniz. Tahmininizi tablodaki ölçülen değerle karşılaştırınız. Bu karşılaştırmadan yararlanarak belirlediğiniz hız denkleminin geçerliliğini sorgulayınız. İki değer arasında belirgin bir fark çıksaydı bunun hangi nedenlerden kaynaklanabileceğini yazınız.</w:t>
+        <w:t>Belirlediğiniz hız denklemini kullanarak Deney 4’teki tepkime hızını tahmin ediniz. Tahmininizi tablodaki ölçülen değerle karşılaştırınız. Bu karşılaştırmadan yararlanarak belirlediğiniz hız denkleminin geçerliliğini sorgulayınız. İki değer arasında belirgin bir fark çıksaydı bunun hangi nedenlerden kaynaklanabileceğini yazınız.</w:t>
       </w:r>
     </w:p>
     <w:p>
@@ -1576,52 +1668,52 @@
           <w:rFonts w:ascii="Times New Roman" w:hAnsi="Times New Roman" w:cs="Times New Roman"/>
           <w:lang w:val="tr-TR"/>
         </w:rPr>
-        <w:t xml:space="preserve">2NO</w:t>
-      </w:r>
-      <w:r>
-        <w:rPr>
-          <w:rFonts w:ascii="Times New Roman" w:hAnsi="Times New Roman" w:cs="Times New Roman"/>
-          <w:lang w:val="tr-TR"/>
+        <w:t>2NO</w:t>
+      </w:r>
+      <w:r>
+        <w:rPr>
+          <w:rFonts w:ascii="Times New Roman" w:hAnsi="Times New Roman" w:cs="Times New Roman"/>
           <w:vertAlign w:val="subscript"/>
-        </w:rPr>
-        <w:t xml:space="preserve">2</w:t>
-      </w:r>
-      <w:r>
-        <w:rPr>
-          <w:rFonts w:ascii="Times New Roman" w:hAnsi="Times New Roman" w:cs="Times New Roman"/>
-          <w:lang w:val="tr-TR"/>
-        </w:rPr>
-        <w:t xml:space="preserve">(g) + F</w:t>
-      </w:r>
-      <w:r>
-        <w:rPr>
-          <w:rFonts w:ascii="Times New Roman" w:hAnsi="Times New Roman" w:cs="Times New Roman"/>
-          <w:lang w:val="tr-TR"/>
+          <w:lang w:val="tr-TR"/>
+        </w:rPr>
+        <w:t>2</w:t>
+      </w:r>
+      <w:r>
+        <w:rPr>
+          <w:rFonts w:ascii="Times New Roman" w:hAnsi="Times New Roman" w:cs="Times New Roman"/>
+          <w:lang w:val="tr-TR"/>
+        </w:rPr>
+        <w:t>(g) + F</w:t>
+      </w:r>
+      <w:r>
+        <w:rPr>
+          <w:rFonts w:ascii="Times New Roman" w:hAnsi="Times New Roman" w:cs="Times New Roman"/>
           <w:vertAlign w:val="subscript"/>
-        </w:rPr>
-        <w:t xml:space="preserve">2</w:t>
-      </w:r>
-      <w:r>
-        <w:rPr>
-          <w:rFonts w:ascii="Times New Roman" w:hAnsi="Times New Roman" w:cs="Times New Roman"/>
-          <w:lang w:val="tr-TR"/>
-        </w:rPr>
-        <w:t xml:space="preserve">(g) → 2NO</w:t>
-      </w:r>
-      <w:r>
-        <w:rPr>
-          <w:rFonts w:ascii="Times New Roman" w:hAnsi="Times New Roman" w:cs="Times New Roman"/>
-          <w:lang w:val="tr-TR"/>
+          <w:lang w:val="tr-TR"/>
+        </w:rPr>
+        <w:t>2</w:t>
+      </w:r>
+      <w:r>
+        <w:rPr>
+          <w:rFonts w:ascii="Times New Roman" w:hAnsi="Times New Roman" w:cs="Times New Roman"/>
+          <w:lang w:val="tr-TR"/>
+        </w:rPr>
+        <w:t>(g) → 2NO</w:t>
+      </w:r>
+      <w:r>
+        <w:rPr>
+          <w:rFonts w:ascii="Times New Roman" w:hAnsi="Times New Roman" w:cs="Times New Roman"/>
           <w:vertAlign w:val="subscript"/>
-        </w:rPr>
-        <w:t xml:space="preserve">2</w:t>
-      </w:r>
-      <w:r>
-        <w:rPr>
-          <w:rFonts w:ascii="Times New Roman" w:hAnsi="Times New Roman" w:cs="Times New Roman"/>
-          <w:lang w:val="tr-TR"/>
-        </w:rPr>
-        <w:t xml:space="preserve">F(g) tepkimesi için belirli bir sıcaklıkta farklı başlangıç derişimleriyle yapılan deneylerde ölçülen başlangıç hızları aşağıdaki tabloda verilmiştir.</w:t>
+          <w:lang w:val="tr-TR"/>
+        </w:rPr>
+        <w:t>2</w:t>
+      </w:r>
+      <w:r>
+        <w:rPr>
+          <w:rFonts w:ascii="Times New Roman" w:hAnsi="Times New Roman" w:cs="Times New Roman"/>
+          <w:lang w:val="tr-TR"/>
+        </w:rPr>
+        <w:t>F(g) tepkimesi için belirli bir sıcaklıkta farklı başlangıç derişimleriyle yapılan deneylerde ölçülen başlangıç hızları aşağıdaki tabloda verilmiştir.</w:t>
       </w:r>
     </w:p>
     <w:tbl>
@@ -1672,6 +1764,7 @@
                 <w:bCs/>
                 <w:lang w:val="tr-TR"/>
               </w:rPr>
+              <w:lastRenderedPageBreak/>
               <w:t>Deney</w:t>
             </w:r>
           </w:p>
@@ -1743,22 +1836,22 @@
                 <w:rFonts w:ascii="Times New Roman" w:hAnsi="Times New Roman" w:cs="Times New Roman"/>
                 <w:lang w:val="tr-TR"/>
               </w:rPr>
-              <w:t xml:space="preserve">[F</w:t>
-            </w:r>
-            <w:r>
-              <w:rPr>
-                <w:rFonts w:ascii="Times New Roman" w:hAnsi="Times New Roman" w:cs="Times New Roman"/>
-                <w:lang w:val="tr-TR"/>
+              <w:t>[F</w:t>
+            </w:r>
+            <w:r>
+              <w:rPr>
+                <w:rFonts w:ascii="Times New Roman" w:hAnsi="Times New Roman" w:cs="Times New Roman"/>
                 <w:vertAlign w:val="subscript"/>
-              </w:rPr>
-              <w:t xml:space="preserve">2</w:t>
-            </w:r>
-            <w:r>
-              <w:rPr>
-                <w:rFonts w:ascii="Times New Roman" w:hAnsi="Times New Roman" w:cs="Times New Roman"/>
-                <w:lang w:val="tr-TR"/>
-              </w:rPr>
-              <w:t xml:space="preserve">] (mol/L)</w:t>
+                <w:lang w:val="tr-TR"/>
+              </w:rPr>
+              <w:t>2</w:t>
+            </w:r>
+            <w:r>
+              <w:rPr>
+                <w:rFonts w:ascii="Times New Roman" w:hAnsi="Times New Roman" w:cs="Times New Roman"/>
+                <w:lang w:val="tr-TR"/>
+              </w:rPr>
+              <w:t>] (mol/L)</w:t>
             </w:r>
           </w:p>
         </w:tc>
@@ -1856,7 +1949,7 @@
                 <w:rFonts w:ascii="Times New Roman" w:hAnsi="Times New Roman" w:cs="Times New Roman"/>
                 <w:lang w:val="tr-TR"/>
               </w:rPr>
-              <w:t xml:space="preserve">0,10</w:t>
+              <w:t>0,10</w:t>
             </w:r>
           </w:p>
         </w:tc>
@@ -1878,15 +1971,15 @@
                 <w:rFonts w:ascii="Times New Roman" w:hAnsi="Times New Roman" w:cs="Times New Roman"/>
                 <w:lang w:val="tr-TR"/>
               </w:rPr>
-              <w:t xml:space="preserve">4,0·10</w:t>
-            </w:r>
-            <w:r>
-              <w:rPr>
-                <w:rFonts w:ascii="Times New Roman" w:hAnsi="Times New Roman" w:cs="Times New Roman"/>
-                <w:lang w:val="tr-TR"/>
+              <w:t>4,0·10</w:t>
+            </w:r>
+            <w:r>
+              <w:rPr>
+                <w:rFonts w:ascii="Times New Roman" w:hAnsi="Times New Roman" w:cs="Times New Roman"/>
                 <w:vertAlign w:val="superscript"/>
-              </w:rPr>
-              <w:t xml:space="preserve">-3</w:t>
+                <w:lang w:val="tr-TR"/>
+              </w:rPr>
+              <w:t>-3</w:t>
             </w:r>
           </w:p>
         </w:tc>
@@ -1957,7 +2050,7 @@
                 <w:rFonts w:ascii="Times New Roman" w:hAnsi="Times New Roman" w:cs="Times New Roman"/>
                 <w:lang w:val="tr-TR"/>
               </w:rPr>
-              <w:t xml:space="preserve">0,10</w:t>
+              <w:t>0,10</w:t>
             </w:r>
           </w:p>
         </w:tc>
@@ -1979,15 +2072,15 @@
                 <w:rFonts w:ascii="Times New Roman" w:hAnsi="Times New Roman" w:cs="Times New Roman"/>
                 <w:lang w:val="tr-TR"/>
               </w:rPr>
-              <w:t xml:space="preserve">8,0·10</w:t>
-            </w:r>
-            <w:r>
-              <w:rPr>
-                <w:rFonts w:ascii="Times New Roman" w:hAnsi="Times New Roman" w:cs="Times New Roman"/>
-                <w:lang w:val="tr-TR"/>
+              <w:t>8,0·10</w:t>
+            </w:r>
+            <w:r>
+              <w:rPr>
+                <w:rFonts w:ascii="Times New Roman" w:hAnsi="Times New Roman" w:cs="Times New Roman"/>
                 <w:vertAlign w:val="superscript"/>
-              </w:rPr>
-              <w:t xml:space="preserve">-3</w:t>
+                <w:lang w:val="tr-TR"/>
+              </w:rPr>
+              <w:t>-3</w:t>
             </w:r>
           </w:p>
         </w:tc>
@@ -2058,7 +2151,7 @@
                 <w:rFonts w:ascii="Times New Roman" w:hAnsi="Times New Roman" w:cs="Times New Roman"/>
                 <w:lang w:val="tr-TR"/>
               </w:rPr>
-              <w:t xml:space="preserve">0,30</w:t>
+              <w:t>0,30</w:t>
             </w:r>
           </w:p>
         </w:tc>
@@ -2080,15 +2173,15 @@
                 <w:rFonts w:ascii="Times New Roman" w:hAnsi="Times New Roman" w:cs="Times New Roman"/>
                 <w:lang w:val="tr-TR"/>
               </w:rPr>
-              <w:t xml:space="preserve">1,2·10</w:t>
-            </w:r>
-            <w:r>
-              <w:rPr>
-                <w:rFonts w:ascii="Times New Roman" w:hAnsi="Times New Roman" w:cs="Times New Roman"/>
-                <w:lang w:val="tr-TR"/>
+              <w:t>1,2·10</w:t>
+            </w:r>
+            <w:r>
+              <w:rPr>
+                <w:rFonts w:ascii="Times New Roman" w:hAnsi="Times New Roman" w:cs="Times New Roman"/>
                 <w:vertAlign w:val="superscript"/>
-              </w:rPr>
-              <w:t xml:space="preserve">-2</w:t>
+                <w:lang w:val="tr-TR"/>
+              </w:rPr>
+              <w:t>-2</w:t>
             </w:r>
           </w:p>
         </w:tc>
@@ -2193,7 +2286,7 @@
           <w:rFonts w:ascii="Times New Roman" w:hAnsi="Times New Roman" w:cs="Times New Roman"/>
           <w:lang w:val="tr-TR"/>
         </w:rPr>
-        <w:t xml:space="preserve">Belirlediğiniz hız denklemindeki üsler tepkime denklemindeki katsayılarla aynı mıdır? 1. Aşamadaki tepkime ile karşılaştırarak “Hız denklemindeki üsler her zaman tepkime denklemindeki katsayılara eşittir.” önermesinin geçerliliğini sorgulayınız. Sorgulamanızı ders kitabınızdaki ve güvenilir bilimsel kaynaklardaki bilgilerle destekleyiniz.</w:t>
+        <w:t>Belirlediğiniz hız denklemindeki üsler tepkime denklemindeki katsayılarla aynı mıdır? 1. Aşamadaki tepkime ile karşılaştırarak “Hız denklemindeki üsler her zaman tepkime denklemindeki katsayılara eşittir.” önermesinin geçerliliğini sorgulayınız. Sorgulamanızı ders kitabınızdaki ve güvenilir bilimsel kaynaklardaki bilgilerle destekleyiniz.</w:t>
       </w:r>
     </w:p>
     <w:p>
@@ -2244,7 +2337,6 @@
           <w:rFonts w:ascii="Times New Roman" w:hAnsi="Times New Roman" w:cs="Times New Roman"/>
           <w:lang w:val="tr-TR"/>
         </w:rPr>
-        <w:lastRenderedPageBreak/>
         <w:t>……………………………………………………………………………………………</w:t>
       </w:r>
     </w:p>
@@ -2490,60 +2582,60 @@
           <w:rFonts w:ascii="Times New Roman" w:hAnsi="Times New Roman" w:cs="Times New Roman"/>
           <w:lang w:val="tr-TR"/>
         </w:rPr>
-        <w:t xml:space="preserve">Tepkime hızının tepken derişimlerine bağlılığı her tepken için aynı değildir. Örneğin belirli bir sıcaklıkta gerçekleşen 2NO(g) + 2H</w:t>
-      </w:r>
-      <w:r>
-        <w:rPr>
-          <w:rFonts w:ascii="Times New Roman" w:hAnsi="Times New Roman" w:cs="Times New Roman"/>
-          <w:lang w:val="tr-TR"/>
+        <w:t>Tepkime hızının tepken derişimlerine bağlılığı her tepken için aynı değildir. Örneğin belirli bir sıcaklıkta gerçekleşen 2NO(g) + 2H</w:t>
+      </w:r>
+      <w:r>
+        <w:rPr>
+          <w:rFonts w:ascii="Times New Roman" w:hAnsi="Times New Roman" w:cs="Times New Roman"/>
           <w:vertAlign w:val="subscript"/>
-        </w:rPr>
-        <w:t xml:space="preserve">2</w:t>
-      </w:r>
-      <w:r>
-        <w:rPr>
-          <w:rFonts w:ascii="Times New Roman" w:hAnsi="Times New Roman" w:cs="Times New Roman"/>
-          <w:lang w:val="tr-TR"/>
-        </w:rPr>
-        <w:t xml:space="preserve">(g) → N</w:t>
-      </w:r>
-      <w:r>
-        <w:rPr>
-          <w:rFonts w:ascii="Times New Roman" w:hAnsi="Times New Roman" w:cs="Times New Roman"/>
-          <w:lang w:val="tr-TR"/>
+          <w:lang w:val="tr-TR"/>
+        </w:rPr>
+        <w:t>2</w:t>
+      </w:r>
+      <w:r>
+        <w:rPr>
+          <w:rFonts w:ascii="Times New Roman" w:hAnsi="Times New Roman" w:cs="Times New Roman"/>
+          <w:lang w:val="tr-TR"/>
+        </w:rPr>
+        <w:t>(g) → N</w:t>
+      </w:r>
+      <w:r>
+        <w:rPr>
+          <w:rFonts w:ascii="Times New Roman" w:hAnsi="Times New Roman" w:cs="Times New Roman"/>
           <w:vertAlign w:val="subscript"/>
-        </w:rPr>
-        <w:t xml:space="preserve">2</w:t>
-      </w:r>
-      <w:r>
-        <w:rPr>
-          <w:rFonts w:ascii="Times New Roman" w:hAnsi="Times New Roman" w:cs="Times New Roman"/>
-          <w:lang w:val="tr-TR"/>
-        </w:rPr>
-        <w:t xml:space="preserve">(g) + 2H</w:t>
-      </w:r>
-      <w:r>
-        <w:rPr>
-          <w:rFonts w:ascii="Times New Roman" w:hAnsi="Times New Roman" w:cs="Times New Roman"/>
-          <w:lang w:val="tr-TR"/>
+          <w:lang w:val="tr-TR"/>
+        </w:rPr>
+        <w:t>2</w:t>
+      </w:r>
+      <w:r>
+        <w:rPr>
+          <w:rFonts w:ascii="Times New Roman" w:hAnsi="Times New Roman" w:cs="Times New Roman"/>
+          <w:lang w:val="tr-TR"/>
+        </w:rPr>
+        <w:t>(g) + 2H</w:t>
+      </w:r>
+      <w:r>
+        <w:rPr>
+          <w:rFonts w:ascii="Times New Roman" w:hAnsi="Times New Roman" w:cs="Times New Roman"/>
           <w:vertAlign w:val="subscript"/>
-        </w:rPr>
-        <w:t xml:space="preserve">2</w:t>
-      </w:r>
-      <w:r>
-        <w:rPr>
-          <w:rFonts w:ascii="Times New Roman" w:hAnsi="Times New Roman" w:cs="Times New Roman"/>
-          <w:lang w:val="tr-TR"/>
-        </w:rPr>
-        <w:t xml:space="preserve">O(g) tepkimesinde H</w:t>
-      </w:r>
-      <w:r>
-        <w:rPr>
-          <w:rFonts w:ascii="Times New Roman" w:hAnsi="Times New Roman" w:cs="Times New Roman"/>
-          <w:lang w:val="tr-TR"/>
+          <w:lang w:val="tr-TR"/>
+        </w:rPr>
+        <w:t>2</w:t>
+      </w:r>
+      <w:r>
+        <w:rPr>
+          <w:rFonts w:ascii="Times New Roman" w:hAnsi="Times New Roman" w:cs="Times New Roman"/>
+          <w:lang w:val="tr-TR"/>
+        </w:rPr>
+        <w:t>O(g) tepkimesinde H</w:t>
+      </w:r>
+      <w:r>
+        <w:rPr>
+          <w:rFonts w:ascii="Times New Roman" w:hAnsi="Times New Roman" w:cs="Times New Roman"/>
           <w:vertAlign w:val="subscript"/>
-        </w:rPr>
-        <w:t xml:space="preserve">2</w:t>
+          <w:lang w:val="tr-TR"/>
+        </w:rPr>
+        <w:t>2</w:t>
       </w:r>
       <w:r>
         <w:rPr>
@@ -2555,10 +2647,10 @@
       <w:r>
         <w:rPr>
           <w:rFonts w:ascii="Times New Roman" w:hAnsi="Times New Roman" w:cs="Times New Roman"/>
-          <w:lang w:val="tr-TR"/>
           <w:vertAlign w:val="subscript"/>
-        </w:rPr>
-        <w:t xml:space="preserve">2</w:t>
+          <w:lang w:val="tr-TR"/>
+        </w:rPr>
+        <w:t>2</w:t>
       </w:r>
       <w:r>
         <w:rPr>
@@ -2570,132 +2662,140 @@
       <w:r>
         <w:rPr>
           <w:rFonts w:ascii="Times New Roman" w:hAnsi="Times New Roman" w:cs="Times New Roman"/>
-          <w:lang w:val="tr-TR"/>
           <w:vertAlign w:val="subscript"/>
-        </w:rPr>
-        <w:t xml:space="preserve">2</w:t>
-      </w:r>
-      <w:r>
-        <w:rPr>
-          <w:rFonts w:ascii="Times New Roman" w:hAnsi="Times New Roman" w:cs="Times New Roman"/>
-          <w:lang w:val="tr-TR"/>
-        </w:rPr>
-        <w:t xml:space="preserve"> derişimiyle ise doğru orantılıdır ve tepkimenin hız denklemi r = k[NO]</w:t>
-      </w:r>
-      <w:r>
-        <w:rPr>
-          <w:rFonts w:ascii="Times New Roman" w:hAnsi="Times New Roman" w:cs="Times New Roman"/>
-          <w:lang w:val="tr-TR"/>
+          <w:lang w:val="tr-TR"/>
+        </w:rPr>
+        <w:t>2</w:t>
+      </w:r>
+      <w:r>
+        <w:rPr>
+          <w:rFonts w:ascii="Times New Roman" w:hAnsi="Times New Roman" w:cs="Times New Roman"/>
+          <w:lang w:val="tr-TR"/>
+        </w:rPr>
+        <w:t xml:space="preserve"> derişimiyle ise doğru orantılıdır ve tepkimenin hız </w:t>
+      </w:r>
+      <w:r>
+        <w:rPr>
+          <w:rFonts w:ascii="Times New Roman" w:hAnsi="Times New Roman" w:cs="Times New Roman"/>
+          <w:lang w:val="tr-TR"/>
+        </w:rPr>
+        <w:lastRenderedPageBreak/>
+        <w:t>denklemi r = k[NO]</w:t>
+      </w:r>
+      <w:r>
+        <w:rPr>
+          <w:rFonts w:ascii="Times New Roman" w:hAnsi="Times New Roman" w:cs="Times New Roman"/>
           <w:vertAlign w:val="superscript"/>
-        </w:rPr>
-        <w:t xml:space="preserve">2</w:t>
-      </w:r>
-      <w:r>
-        <w:rPr>
-          <w:rFonts w:ascii="Times New Roman" w:hAnsi="Times New Roman" w:cs="Times New Roman"/>
-          <w:lang w:val="tr-TR"/>
-        </w:rPr>
-        <w:t xml:space="preserve">[H</w:t>
-      </w:r>
-      <w:r>
-        <w:rPr>
-          <w:rFonts w:ascii="Times New Roman" w:hAnsi="Times New Roman" w:cs="Times New Roman"/>
-          <w:lang w:val="tr-TR"/>
+          <w:lang w:val="tr-TR"/>
+        </w:rPr>
+        <w:t>2</w:t>
+      </w:r>
+      <w:r>
+        <w:rPr>
+          <w:rFonts w:ascii="Times New Roman" w:hAnsi="Times New Roman" w:cs="Times New Roman"/>
+          <w:lang w:val="tr-TR"/>
+        </w:rPr>
+        <w:t>[H</w:t>
+      </w:r>
+      <w:r>
+        <w:rPr>
+          <w:rFonts w:ascii="Times New Roman" w:hAnsi="Times New Roman" w:cs="Times New Roman"/>
           <w:vertAlign w:val="subscript"/>
-        </w:rPr>
-        <w:t xml:space="preserve">2</w:t>
-      </w:r>
-      <w:r>
-        <w:rPr>
-          <w:rFonts w:ascii="Times New Roman" w:hAnsi="Times New Roman" w:cs="Times New Roman"/>
-          <w:lang w:val="tr-TR"/>
-        </w:rPr>
-        <w:t xml:space="preserve">] şeklinde yazılır. Hız denklemi bazı kaynaklarda hız yasası olarak da adlandırılır.</w:t>
-      </w:r>
-    </w:p>
-    <w:p>
-      <w:pPr>
-        <w:jc w:val="both"/>
-        <w:rPr>
-          <w:rFonts w:ascii="Times New Roman" w:hAnsi="Times New Roman" w:cs="Times New Roman"/>
-          <w:lang w:val="tr-TR"/>
-        </w:rPr>
-      </w:pPr>
-      <w:r>
-        <w:rPr>
-          <w:rFonts w:ascii="Times New Roman" w:hAnsi="Times New Roman" w:cs="Times New Roman"/>
-          <w:lang w:val="tr-TR"/>
-        </w:rPr>
-        <w:t xml:space="preserve">Önceki konuda sıcaklığın, katalizörün ve katı tepkenin temas yüzeyinin, tepken derişimleri değişmeden de tepkime hızını değiştirebildiğini gördünüz. Hız denkleminde derişimler aynı kalırken hızın değişebilmesi ancak k’nin değişmesiyle açıklanabilir. Buna göre hız sabiti tepkimenin türüne, sıcaklığa, katalizöre ve katı tepken içeren tepkimelerde katının temas yüzeyine bağlıdır; tepken derişimlerine bağlı değildir. Sıcaklık arttıkça, ortama katalizör eklendiğinde ya da katı tepkenin temas yüzeyi artırıldığında hız sabitinin değeri artar. Hız denklemindeki üsler tepkimenin derecesini gösterir. Örneğin hız denklemi r = k[NO]</w:t>
-      </w:r>
-      <w:r>
-        <w:rPr>
-          <w:rFonts w:ascii="Times New Roman" w:hAnsi="Times New Roman" w:cs="Times New Roman"/>
-          <w:lang w:val="tr-TR"/>
+          <w:lang w:val="tr-TR"/>
+        </w:rPr>
+        <w:t>2</w:t>
+      </w:r>
+      <w:r>
+        <w:rPr>
+          <w:rFonts w:ascii="Times New Roman" w:hAnsi="Times New Roman" w:cs="Times New Roman"/>
+          <w:lang w:val="tr-TR"/>
+        </w:rPr>
+        <w:t>] şeklinde yazılır. Hız denklemi bazı kaynaklarda hız yasası olarak da adlandırılır.</w:t>
+      </w:r>
+    </w:p>
+    <w:p>
+      <w:pPr>
+        <w:jc w:val="both"/>
+        <w:rPr>
+          <w:rFonts w:ascii="Times New Roman" w:hAnsi="Times New Roman" w:cs="Times New Roman"/>
+          <w:lang w:val="tr-TR"/>
+        </w:rPr>
+      </w:pPr>
+      <w:r>
+        <w:rPr>
+          <w:rFonts w:ascii="Times New Roman" w:hAnsi="Times New Roman" w:cs="Times New Roman"/>
+          <w:lang w:val="tr-TR"/>
+        </w:rPr>
+        <w:t>Önceki konuda sıcaklığın, katalizörün ve katı tepkenin temas yüzeyinin, tepken derişimleri değişmeden de tepkime hızını değiştirebildiğini gördünüz. Hız denkleminde derişimler aynı kalırken hızın değişebilmesi ancak k’nin değişmesiyle açıklanabilir. Buna göre hız sabiti tepkimenin türüne, sıcaklığa, katalizöre ve katı tepken içeren tepkimelerde katının temas yüzeyine bağlıdır; tepken derişimlerine bağlı değildir. Sıcaklık arttıkça, ortama katalizör eklendiğinde ya da katı tepkenin temas yüzeyi artırıldığında hız sabitinin değeri artar. Hız denklemindeki üsler tepkimenin derecesini gösterir. Örneğin hız denklemi r = k[NO]</w:t>
+      </w:r>
+      <w:r>
+        <w:rPr>
+          <w:rFonts w:ascii="Times New Roman" w:hAnsi="Times New Roman" w:cs="Times New Roman"/>
           <w:vertAlign w:val="superscript"/>
-        </w:rPr>
-        <w:t xml:space="preserve">2</w:t>
-      </w:r>
-      <w:r>
-        <w:rPr>
-          <w:rFonts w:ascii="Times New Roman" w:hAnsi="Times New Roman" w:cs="Times New Roman"/>
-          <w:lang w:val="tr-TR"/>
-        </w:rPr>
-        <w:t xml:space="preserve">[H</w:t>
-      </w:r>
-      <w:r>
-        <w:rPr>
-          <w:rFonts w:ascii="Times New Roman" w:hAnsi="Times New Roman" w:cs="Times New Roman"/>
-          <w:lang w:val="tr-TR"/>
+          <w:lang w:val="tr-TR"/>
+        </w:rPr>
+        <w:t>2</w:t>
+      </w:r>
+      <w:r>
+        <w:rPr>
+          <w:rFonts w:ascii="Times New Roman" w:hAnsi="Times New Roman" w:cs="Times New Roman"/>
+          <w:lang w:val="tr-TR"/>
+        </w:rPr>
+        <w:t>[H</w:t>
+      </w:r>
+      <w:r>
+        <w:rPr>
+          <w:rFonts w:ascii="Times New Roman" w:hAnsi="Times New Roman" w:cs="Times New Roman"/>
           <w:vertAlign w:val="subscript"/>
-        </w:rPr>
-        <w:t xml:space="preserve">2</w:t>
-      </w:r>
-      <w:r>
-        <w:rPr>
-          <w:rFonts w:ascii="Times New Roman" w:hAnsi="Times New Roman" w:cs="Times New Roman"/>
-          <w:lang w:val="tr-TR"/>
-        </w:rPr>
-        <w:t xml:space="preserve">] olan tepkime NO’ya göre 2. dereceden, H</w:t>
-      </w:r>
-      <w:r>
-        <w:rPr>
-          <w:rFonts w:ascii="Times New Roman" w:hAnsi="Times New Roman" w:cs="Times New Roman"/>
-          <w:lang w:val="tr-TR"/>
+          <w:lang w:val="tr-TR"/>
+        </w:rPr>
+        <w:t>2</w:t>
+      </w:r>
+      <w:r>
+        <w:rPr>
+          <w:rFonts w:ascii="Times New Roman" w:hAnsi="Times New Roman" w:cs="Times New Roman"/>
+          <w:lang w:val="tr-TR"/>
+        </w:rPr>
+        <w:t>] olan tepkime NO’ya göre 2. dereceden, H</w:t>
+      </w:r>
+      <w:r>
+        <w:rPr>
+          <w:rFonts w:ascii="Times New Roman" w:hAnsi="Times New Roman" w:cs="Times New Roman"/>
           <w:vertAlign w:val="subscript"/>
-        </w:rPr>
-        <w:t xml:space="preserve">2</w:t>
-      </w:r>
-      <w:r>
-        <w:rPr>
-          <w:rFonts w:ascii="Times New Roman" w:hAnsi="Times New Roman" w:cs="Times New Roman"/>
-          <w:lang w:val="tr-TR"/>
-        </w:rPr>
-        <w:t xml:space="preserve">’ye göre 1. dereceden ve toplamda 3. derecedendir.</w:t>
-      </w:r>
-    </w:p>
-    <w:p>
-      <w:pPr>
-        <w:jc w:val="both"/>
-        <w:rPr>
-          <w:rFonts w:ascii="Times New Roman" w:hAnsi="Times New Roman" w:cs="Times New Roman"/>
-          <w:lang w:val="tr-TR"/>
-        </w:rPr>
-      </w:pPr>
-      <w:r>
-        <w:rPr>
-          <w:rFonts w:ascii="Times New Roman" w:hAnsi="Times New Roman" w:cs="Times New Roman"/>
-          <w:lang w:val="tr-TR"/>
-        </w:rPr>
-        <w:t xml:space="preserve">Analiz ve Keşif Atölyesi 1.8.’de hız denklemindeki üsleri belirlemek için izlediğiniz yola başlangıç hızları yöntemi denir. Bu yöntemde bir tepkenin derişimi değiştirilirken diğer tepkenlerin derişimleri sabit tutulur ve tepkimenin başlangıç hızındaki değişim incelenir. Bir tepkenin derişimi n katına çıkarıldığında tepkime hızı n</w:t>
-      </w:r>
-      <w:r>
-        <w:rPr>
-          <w:rFonts w:ascii="Times New Roman" w:hAnsi="Times New Roman" w:cs="Times New Roman"/>
-          <w:lang w:val="tr-TR"/>
+          <w:lang w:val="tr-TR"/>
+        </w:rPr>
+        <w:t>2</w:t>
+      </w:r>
+      <w:r>
+        <w:rPr>
+          <w:rFonts w:ascii="Times New Roman" w:hAnsi="Times New Roman" w:cs="Times New Roman"/>
+          <w:lang w:val="tr-TR"/>
+        </w:rPr>
+        <w:t>’ye göre 1. dereceden ve toplamda 3. derecedendir.</w:t>
+      </w:r>
+    </w:p>
+    <w:p>
+      <w:pPr>
+        <w:jc w:val="both"/>
+        <w:rPr>
+          <w:rFonts w:ascii="Times New Roman" w:hAnsi="Times New Roman" w:cs="Times New Roman"/>
+          <w:lang w:val="tr-TR"/>
+        </w:rPr>
+      </w:pPr>
+      <w:r>
+        <w:rPr>
+          <w:rFonts w:ascii="Times New Roman" w:hAnsi="Times New Roman" w:cs="Times New Roman"/>
+          <w:lang w:val="tr-TR"/>
+        </w:rPr>
+        <w:t>Analiz ve Keşif Atölyesi 1.8.’de hız denklemindeki üsleri belirlemek için izlediğiniz yola başlangıç hızları yöntemi denir. Bu yöntemde bir tepkenin derişimi değiştirilirken diğer tepkenlerin derişimleri sabit tutulur ve tepkimenin başlangıç hızındaki değişim incelenir. Bir tepkenin derişimi n katına çıkarıldığında tepkime hızı n</w:t>
+      </w:r>
+      <w:r>
+        <w:rPr>
+          <w:rFonts w:ascii="Times New Roman" w:hAnsi="Times New Roman" w:cs="Times New Roman"/>
           <w:vertAlign w:val="superscript"/>
-        </w:rPr>
-        <w:t xml:space="preserve">x</w:t>
+          <w:lang w:val="tr-TR"/>
+        </w:rPr>
+        <w:t>x</w:t>
       </w:r>
       <w:r>
         <w:rPr>
@@ -2717,7 +2817,6 @@
         <w:rPr>
           <w:noProof/>
         </w:rPr>
-        <w:lastRenderedPageBreak/>
         <w:drawing>
           <wp:inline distT="0" distB="0" distL="0" distR="0" wp14:anchorId="4F53E14A" wp14:editId="5FF6B0DE">
             <wp:extent cx="5400000" cy="1851428"/>
@@ -2734,7 +2833,7 @@
                     <pic:cNvPicPr/>
                   </pic:nvPicPr>
                   <pic:blipFill>
-                    <a:blip r:embed="rId7"/>
+                    <a:blip r:embed="rId8"/>
                     <a:stretch>
                       <a:fillRect/>
                     </a:stretch>
@@ -2793,219 +2892,227 @@
           <w:rFonts w:ascii="Times New Roman" w:hAnsi="Times New Roman" w:cs="Times New Roman"/>
           <w:lang w:val="tr-TR"/>
         </w:rPr>
-        <w:t xml:space="preserve">2NO(g) + 2H</w:t>
-      </w:r>
-      <w:r>
-        <w:rPr>
-          <w:rFonts w:ascii="Times New Roman" w:hAnsi="Times New Roman" w:cs="Times New Roman"/>
-          <w:lang w:val="tr-TR"/>
+        <w:t>2NO(g) + 2H</w:t>
+      </w:r>
+      <w:r>
+        <w:rPr>
+          <w:rFonts w:ascii="Times New Roman" w:hAnsi="Times New Roman" w:cs="Times New Roman"/>
           <w:vertAlign w:val="subscript"/>
-        </w:rPr>
-        <w:t xml:space="preserve">2</w:t>
-      </w:r>
-      <w:r>
-        <w:rPr>
-          <w:rFonts w:ascii="Times New Roman" w:hAnsi="Times New Roman" w:cs="Times New Roman"/>
-          <w:lang w:val="tr-TR"/>
-        </w:rPr>
-        <w:t xml:space="preserve">(g) → N</w:t>
-      </w:r>
-      <w:r>
-        <w:rPr>
-          <w:rFonts w:ascii="Times New Roman" w:hAnsi="Times New Roman" w:cs="Times New Roman"/>
-          <w:lang w:val="tr-TR"/>
+          <w:lang w:val="tr-TR"/>
+        </w:rPr>
+        <w:t>2</w:t>
+      </w:r>
+      <w:r>
+        <w:rPr>
+          <w:rFonts w:ascii="Times New Roman" w:hAnsi="Times New Roman" w:cs="Times New Roman"/>
+          <w:lang w:val="tr-TR"/>
+        </w:rPr>
+        <w:t>(g) → N</w:t>
+      </w:r>
+      <w:r>
+        <w:rPr>
+          <w:rFonts w:ascii="Times New Roman" w:hAnsi="Times New Roman" w:cs="Times New Roman"/>
           <w:vertAlign w:val="subscript"/>
-        </w:rPr>
-        <w:t xml:space="preserve">2</w:t>
-      </w:r>
-      <w:r>
-        <w:rPr>
-          <w:rFonts w:ascii="Times New Roman" w:hAnsi="Times New Roman" w:cs="Times New Roman"/>
-          <w:lang w:val="tr-TR"/>
-        </w:rPr>
-        <w:t xml:space="preserve">(g) + 2H</w:t>
-      </w:r>
-      <w:r>
-        <w:rPr>
-          <w:rFonts w:ascii="Times New Roman" w:hAnsi="Times New Roman" w:cs="Times New Roman"/>
-          <w:lang w:val="tr-TR"/>
+          <w:lang w:val="tr-TR"/>
+        </w:rPr>
+        <w:t>2</w:t>
+      </w:r>
+      <w:r>
+        <w:rPr>
+          <w:rFonts w:ascii="Times New Roman" w:hAnsi="Times New Roman" w:cs="Times New Roman"/>
+          <w:lang w:val="tr-TR"/>
+        </w:rPr>
+        <w:t>(g) + 2H</w:t>
+      </w:r>
+      <w:r>
+        <w:rPr>
+          <w:rFonts w:ascii="Times New Roman" w:hAnsi="Times New Roman" w:cs="Times New Roman"/>
           <w:vertAlign w:val="subscript"/>
-        </w:rPr>
-        <w:t xml:space="preserve">2</w:t>
-      </w:r>
-      <w:r>
-        <w:rPr>
-          <w:rFonts w:ascii="Times New Roman" w:hAnsi="Times New Roman" w:cs="Times New Roman"/>
-          <w:lang w:val="tr-TR"/>
-        </w:rPr>
-        <w:t xml:space="preserve">O(g) tepkimesinde H</w:t>
-      </w:r>
-      <w:r>
-        <w:rPr>
-          <w:rFonts w:ascii="Times New Roman" w:hAnsi="Times New Roman" w:cs="Times New Roman"/>
-          <w:lang w:val="tr-TR"/>
+          <w:lang w:val="tr-TR"/>
+        </w:rPr>
+        <w:t>2</w:t>
+      </w:r>
+      <w:r>
+        <w:rPr>
+          <w:rFonts w:ascii="Times New Roman" w:hAnsi="Times New Roman" w:cs="Times New Roman"/>
+          <w:lang w:val="tr-TR"/>
+        </w:rPr>
+        <w:t>O(g) tepkimesinde H</w:t>
+      </w:r>
+      <w:r>
+        <w:rPr>
+          <w:rFonts w:ascii="Times New Roman" w:hAnsi="Times New Roman" w:cs="Times New Roman"/>
           <w:vertAlign w:val="subscript"/>
-        </w:rPr>
-        <w:t xml:space="preserve">2</w:t>
-      </w:r>
-      <w:r>
-        <w:rPr>
-          <w:rFonts w:ascii="Times New Roman" w:hAnsi="Times New Roman" w:cs="Times New Roman"/>
-          <w:lang w:val="tr-TR"/>
-        </w:rPr>
-        <w:t xml:space="preserve">’nin tepkime denklemindeki katsayısı 2 olduğu hâlde hız denklemindeki üssü 1’dir. Hız denklemindeki üslerin katsayılarla her zaman aynı olmaması, tepkimelerin kaç basamakta gerçekleştiğiyle ilgilidir. Tek basamakta gerçekleşen tepkimelerde, yani tepkenlerin tek bir çarpışma ile doğrudan ürünlere dönüştüğü tepkimelerde, hız denklemindeki üsler tepkime denklemindeki katsayılara eşittir. Örneğin tek basamakta gerçekleşen NO(g) + O</w:t>
-      </w:r>
-      <w:r>
-        <w:rPr>
-          <w:rFonts w:ascii="Times New Roman" w:hAnsi="Times New Roman" w:cs="Times New Roman"/>
-          <w:lang w:val="tr-TR"/>
+          <w:lang w:val="tr-TR"/>
+        </w:rPr>
+        <w:t>2</w:t>
+      </w:r>
+      <w:r>
+        <w:rPr>
+          <w:rFonts w:ascii="Times New Roman" w:hAnsi="Times New Roman" w:cs="Times New Roman"/>
+          <w:lang w:val="tr-TR"/>
+        </w:rPr>
+        <w:t>’nin tepkime denklemindeki katsayısı 2 olduğu hâlde hız denklemindeki üssü 1’dir. Hız denklemindeki üslerin katsayılarla her zaman aynı olmaması, tepkimelerin kaç basamakta gerçekleştiğiyle ilgilidir. Tek basamakta gerçekleşen tepkimelerde, yani tepkenlerin tek bir çarpışma ile doğrudan ürünlere dönüştüğü tepkimelerde, hız denklemindeki üsler tepkime denklemindeki katsayılara eşittir. Örneğin tek basamakta gerçekleşen NO(g) + O</w:t>
+      </w:r>
+      <w:r>
+        <w:rPr>
+          <w:rFonts w:ascii="Times New Roman" w:hAnsi="Times New Roman" w:cs="Times New Roman"/>
           <w:vertAlign w:val="subscript"/>
-        </w:rPr>
-        <w:t xml:space="preserve">3</w:t>
-      </w:r>
-      <w:r>
-        <w:rPr>
-          <w:rFonts w:ascii="Times New Roman" w:hAnsi="Times New Roman" w:cs="Times New Roman"/>
-          <w:lang w:val="tr-TR"/>
-        </w:rPr>
-        <w:t xml:space="preserve">(g) → NO</w:t>
-      </w:r>
-      <w:r>
-        <w:rPr>
-          <w:rFonts w:ascii="Times New Roman" w:hAnsi="Times New Roman" w:cs="Times New Roman"/>
-          <w:lang w:val="tr-TR"/>
+          <w:lang w:val="tr-TR"/>
+        </w:rPr>
+        <w:t>3</w:t>
+      </w:r>
+      <w:r>
+        <w:rPr>
+          <w:rFonts w:ascii="Times New Roman" w:hAnsi="Times New Roman" w:cs="Times New Roman"/>
+          <w:lang w:val="tr-TR"/>
+        </w:rPr>
+        <w:t>(g) → NO</w:t>
+      </w:r>
+      <w:r>
+        <w:rPr>
+          <w:rFonts w:ascii="Times New Roman" w:hAnsi="Times New Roman" w:cs="Times New Roman"/>
           <w:vertAlign w:val="subscript"/>
-        </w:rPr>
-        <w:t xml:space="preserve">2</w:t>
-      </w:r>
-      <w:r>
-        <w:rPr>
-          <w:rFonts w:ascii="Times New Roman" w:hAnsi="Times New Roman" w:cs="Times New Roman"/>
-          <w:lang w:val="tr-TR"/>
-        </w:rPr>
-        <w:t xml:space="preserve">(g) + O</w:t>
-      </w:r>
-      <w:r>
-        <w:rPr>
-          <w:rFonts w:ascii="Times New Roman" w:hAnsi="Times New Roman" w:cs="Times New Roman"/>
-          <w:lang w:val="tr-TR"/>
+          <w:lang w:val="tr-TR"/>
+        </w:rPr>
+        <w:t>2</w:t>
+      </w:r>
+      <w:r>
+        <w:rPr>
+          <w:rFonts w:ascii="Times New Roman" w:hAnsi="Times New Roman" w:cs="Times New Roman"/>
+          <w:lang w:val="tr-TR"/>
+        </w:rPr>
+        <w:t>(g) + O</w:t>
+      </w:r>
+      <w:r>
+        <w:rPr>
+          <w:rFonts w:ascii="Times New Roman" w:hAnsi="Times New Roman" w:cs="Times New Roman"/>
           <w:vertAlign w:val="subscript"/>
-        </w:rPr>
-        <w:t xml:space="preserve">2</w:t>
-      </w:r>
-      <w:r>
-        <w:rPr>
-          <w:rFonts w:ascii="Times New Roman" w:hAnsi="Times New Roman" w:cs="Times New Roman"/>
-          <w:lang w:val="tr-TR"/>
-        </w:rPr>
-        <w:t xml:space="preserve">(g) tepkimesinin hız denklemi r = k[NO][O</w:t>
-      </w:r>
-      <w:r>
-        <w:rPr>
-          <w:rFonts w:ascii="Times New Roman" w:hAnsi="Times New Roman" w:cs="Times New Roman"/>
-          <w:lang w:val="tr-TR"/>
+          <w:lang w:val="tr-TR"/>
+        </w:rPr>
+        <w:t>2</w:t>
+      </w:r>
+      <w:r>
+        <w:rPr>
+          <w:rFonts w:ascii="Times New Roman" w:hAnsi="Times New Roman" w:cs="Times New Roman"/>
+          <w:lang w:val="tr-TR"/>
+        </w:rPr>
+        <w:t>(g) tepkimesinin hız denklemi r = k[NO][O</w:t>
+      </w:r>
+      <w:r>
+        <w:rPr>
+          <w:rFonts w:ascii="Times New Roman" w:hAnsi="Times New Roman" w:cs="Times New Roman"/>
           <w:vertAlign w:val="subscript"/>
-        </w:rPr>
-        <w:t xml:space="preserve">3</w:t>
-      </w:r>
-      <w:r>
-        <w:rPr>
-          <w:rFonts w:ascii="Times New Roman" w:hAnsi="Times New Roman" w:cs="Times New Roman"/>
-          <w:lang w:val="tr-TR"/>
-        </w:rPr>
-        <w:t xml:space="preserve">] şeklindedir. Ancak birçok tepkime birden fazla basamakta gerçekleşir. Bu tepkimelerde hız denklemi, tepkime denklemindeki katsayılara bakılarak yazılamaz. Örneğin 225 °C’nin altındaki sıcaklıklarda NO</w:t>
-      </w:r>
-      <w:r>
-        <w:rPr>
-          <w:rFonts w:ascii="Times New Roman" w:hAnsi="Times New Roman" w:cs="Times New Roman"/>
-          <w:lang w:val="tr-TR"/>
+          <w:lang w:val="tr-TR"/>
+        </w:rPr>
+        <w:t>3</w:t>
+      </w:r>
+      <w:r>
+        <w:rPr>
+          <w:rFonts w:ascii="Times New Roman" w:hAnsi="Times New Roman" w:cs="Times New Roman"/>
+          <w:lang w:val="tr-TR"/>
+        </w:rPr>
+        <w:t>] şeklindedir. Ancak birçok tepkime birden fazla basamakta gerçekleşir. Bu tepkimelerde hız denklemi, tepkime denklemindeki katsayılara bakılarak yazılamaz. Örneğin 225 °C’nin altındaki sıcaklıklarda NO</w:t>
+      </w:r>
+      <w:r>
+        <w:rPr>
+          <w:rFonts w:ascii="Times New Roman" w:hAnsi="Times New Roman" w:cs="Times New Roman"/>
           <w:vertAlign w:val="subscript"/>
-        </w:rPr>
-        <w:t xml:space="preserve">2</w:t>
-      </w:r>
-      <w:r>
-        <w:rPr>
-          <w:rFonts w:ascii="Times New Roman" w:hAnsi="Times New Roman" w:cs="Times New Roman"/>
-          <w:lang w:val="tr-TR"/>
-        </w:rPr>
-        <w:t xml:space="preserve">(g) + CO(g) → NO(g) + CO</w:t>
-      </w:r>
-      <w:r>
-        <w:rPr>
-          <w:rFonts w:ascii="Times New Roman" w:hAnsi="Times New Roman" w:cs="Times New Roman"/>
-          <w:lang w:val="tr-TR"/>
+          <w:lang w:val="tr-TR"/>
+        </w:rPr>
+        <w:t>2</w:t>
+      </w:r>
+      <w:r>
+        <w:rPr>
+          <w:rFonts w:ascii="Times New Roman" w:hAnsi="Times New Roman" w:cs="Times New Roman"/>
+          <w:lang w:val="tr-TR"/>
+        </w:rPr>
+        <w:t>(g) + CO(g) → NO(g) + CO</w:t>
+      </w:r>
+      <w:r>
+        <w:rPr>
+          <w:rFonts w:ascii="Times New Roman" w:hAnsi="Times New Roman" w:cs="Times New Roman"/>
           <w:vertAlign w:val="subscript"/>
-        </w:rPr>
-        <w:t xml:space="preserve">2</w:t>
-      </w:r>
-      <w:r>
-        <w:rPr>
-          <w:rFonts w:ascii="Times New Roman" w:hAnsi="Times New Roman" w:cs="Times New Roman"/>
-          <w:lang w:val="tr-TR"/>
-        </w:rPr>
-        <w:t xml:space="preserve">(g) tepkimesinin hız denklemi r = k[NO</w:t>
-      </w:r>
-      <w:r>
-        <w:rPr>
-          <w:rFonts w:ascii="Times New Roman" w:hAnsi="Times New Roman" w:cs="Times New Roman"/>
-          <w:lang w:val="tr-TR"/>
+          <w:lang w:val="tr-TR"/>
+        </w:rPr>
+        <w:t>2</w:t>
+      </w:r>
+      <w:r>
+        <w:rPr>
+          <w:rFonts w:ascii="Times New Roman" w:hAnsi="Times New Roman" w:cs="Times New Roman"/>
+          <w:lang w:val="tr-TR"/>
+        </w:rPr>
+        <w:t>(g) tepkimesinin hız denklemi r = k[NO</w:t>
+      </w:r>
+      <w:r>
+        <w:rPr>
+          <w:rFonts w:ascii="Times New Roman" w:hAnsi="Times New Roman" w:cs="Times New Roman"/>
           <w:vertAlign w:val="subscript"/>
-        </w:rPr>
-        <w:t xml:space="preserve">2</w:t>
-      </w:r>
-      <w:r>
-        <w:rPr>
-          <w:rFonts w:ascii="Times New Roman" w:hAnsi="Times New Roman" w:cs="Times New Roman"/>
-          <w:lang w:val="tr-TR"/>
-        </w:rPr>
-        <w:t xml:space="preserve">]</w:t>
-      </w:r>
-      <w:r>
-        <w:rPr>
-          <w:rFonts w:ascii="Times New Roman" w:hAnsi="Times New Roman" w:cs="Times New Roman"/>
-          <w:lang w:val="tr-TR"/>
+          <w:lang w:val="tr-TR"/>
+        </w:rPr>
+        <w:t>2</w:t>
+      </w:r>
+      <w:r>
+        <w:rPr>
+          <w:rFonts w:ascii="Times New Roman" w:hAnsi="Times New Roman" w:cs="Times New Roman"/>
+          <w:lang w:val="tr-TR"/>
+        </w:rPr>
+        <w:t>]</w:t>
+      </w:r>
+      <w:r>
+        <w:rPr>
+          <w:rFonts w:ascii="Times New Roman" w:hAnsi="Times New Roman" w:cs="Times New Roman"/>
           <w:vertAlign w:val="superscript"/>
-        </w:rPr>
-        <w:t xml:space="preserve">2</w:t>
-      </w:r>
-      <w:r>
-        <w:rPr>
-          <w:rFonts w:ascii="Times New Roman" w:hAnsi="Times New Roman" w:cs="Times New Roman"/>
-          <w:lang w:val="tr-TR"/>
-        </w:rPr>
-        <w:t xml:space="preserve"> şeklindedir ve CO’nun derişimi tepkime hızını etkilemez. Bu nedenle bir tepkimenin hız denklemi kesin olarak ancak deneysel verilerle belirlenebilir. Çok basamaklı tepkimelerin hız denklemlerinin nasıl yazıldığı aşağıda “Çok Basamaklı Tepkimeler” başlığında açıklanmıştır.</w:t>
-      </w:r>
-    </w:p>
-    <w:p>
-      <w:pPr>
-        <w:jc w:val="both"/>
-        <w:rPr>
-          <w:rFonts w:ascii="Times New Roman" w:hAnsi="Times New Roman" w:cs="Times New Roman"/>
-          <w:lang w:val="tr-TR"/>
-        </w:rPr>
-      </w:pPr>
-      <w:r>
-        <w:rPr>
-          <w:rFonts w:ascii="Times New Roman" w:hAnsi="Times New Roman" w:cs="Times New Roman"/>
-          <w:lang w:val="tr-TR"/>
-        </w:rPr>
-        <w:t xml:space="preserve">Hız denkleminde yalnızca derişimi değişebilen gaz ve çözelti (suda) hâlindeki tepkenler yer alır. Sıcaklık sabit kaldığı sürece katıların ve saf sıvıların derişimi değişmediğinden bu maddeler hız denkleminde yazılmaz. Gaz fazındaki tepkimelerde kabın hacmi değiştirildiğinde tüm gazların derişimi aynı oranda değişir. Örneğin sabit sıcaklıkta kabın hacmi yarıya indirildiğinde her bir gazın derişimi iki katına çıkar.</w:t>
-      </w:r>
-    </w:p>
-    <w:p>
-      <w:pPr>
-        <w:jc w:val="both"/>
-        <w:rPr>
-          <w:rFonts w:ascii="Times New Roman" w:hAnsi="Times New Roman" w:cs="Times New Roman"/>
-          <w:lang w:val="tr-TR"/>
-        </w:rPr>
-      </w:pPr>
-      <w:r>
-        <w:rPr>
-          <w:rFonts w:ascii="Times New Roman" w:hAnsi="Times New Roman" w:cs="Times New Roman"/>
-          <w:lang w:val="tr-TR"/>
-        </w:rPr>
-        <w:t xml:space="preserve">Hız sabitinin birimi tepkimenin toplam derecesine bağlıdır. Tepkime hızı (r) mol/L·s, derişim mol/L birimiyle ifade edildiğinde k’nin birimi aşağıdaki tabloda verildiği gibi olur.</w:t>
+          <w:lang w:val="tr-TR"/>
+        </w:rPr>
+        <w:t>2</w:t>
+      </w:r>
+      <w:r>
+        <w:rPr>
+          <w:rFonts w:ascii="Times New Roman" w:hAnsi="Times New Roman" w:cs="Times New Roman"/>
+          <w:lang w:val="tr-TR"/>
+        </w:rPr>
+        <w:t xml:space="preserve"> şeklindedir ve CO’nun derişimi tepkime hızını etkilemez. Bu nedenle bir tepkimenin hız denklemi kesin olarak ancak </w:t>
+      </w:r>
+      <w:r>
+        <w:rPr>
+          <w:rFonts w:ascii="Times New Roman" w:hAnsi="Times New Roman" w:cs="Times New Roman"/>
+          <w:lang w:val="tr-TR"/>
+        </w:rPr>
+        <w:lastRenderedPageBreak/>
+        <w:t>deneysel verilerle belirlenebilir. Çok basamaklı tepkimelerin hız denklemlerinin nasıl yazıldığı aşağıda “Çok Basamaklı Tepkimeler” başlığında açıklanmıştır.</w:t>
+      </w:r>
+    </w:p>
+    <w:p>
+      <w:pPr>
+        <w:jc w:val="both"/>
+        <w:rPr>
+          <w:rFonts w:ascii="Times New Roman" w:hAnsi="Times New Roman" w:cs="Times New Roman"/>
+          <w:lang w:val="tr-TR"/>
+        </w:rPr>
+      </w:pPr>
+      <w:r>
+        <w:rPr>
+          <w:rFonts w:ascii="Times New Roman" w:hAnsi="Times New Roman" w:cs="Times New Roman"/>
+          <w:lang w:val="tr-TR"/>
+        </w:rPr>
+        <w:t>Hız denkleminde yalnızca derişimi değişebilen gaz ve çözelti (suda) hâlindeki tepkenler yer alır. Sıcaklık sabit kaldığı sürece katıların ve saf sıvıların derişimi değişmediğinden bu maddeler hız denkleminde yazılmaz. Gaz fazındaki tepkimelerde kabın hacmi değiştirildiğinde tüm gazların derişimi aynı oranda değişir. Örneğin sabit sıcaklıkta kabın hacmi yarıya indirildiğinde her bir gazın derişimi iki katına çıkar.</w:t>
+      </w:r>
+    </w:p>
+    <w:p>
+      <w:pPr>
+        <w:jc w:val="both"/>
+        <w:rPr>
+          <w:rFonts w:ascii="Times New Roman" w:hAnsi="Times New Roman" w:cs="Times New Roman"/>
+          <w:lang w:val="tr-TR"/>
+        </w:rPr>
+      </w:pPr>
+      <w:r>
+        <w:rPr>
+          <w:rFonts w:ascii="Times New Roman" w:hAnsi="Times New Roman" w:cs="Times New Roman"/>
+          <w:lang w:val="tr-TR"/>
+        </w:rPr>
+        <w:t>Hız sabitinin birimi tepkimenin toplam derecesine bağlıdır. Tepkime hızı (r) mol/L·s, derişim mol/L birimiyle ifade edildiğinde k’nin birimi aşağıdaki tabloda verildiği gibi olur.</w:t>
       </w:r>
     </w:p>
     <w:p>
@@ -3404,7 +3511,6 @@
                 <w:rFonts w:ascii="Times New Roman" w:hAnsi="Times New Roman" w:cs="Times New Roman"/>
                 <w:lang w:val="tr-TR"/>
               </w:rPr>
-              <w:lastRenderedPageBreak/>
               <w:t>3</w:t>
             </w:r>
           </w:p>
@@ -4501,7 +4607,6 @@
           <w:bCs/>
           <w:lang w:val="tr-TR"/>
         </w:rPr>
-        <w:lastRenderedPageBreak/>
         <w:t>Örnek-Çözüm Atölyesi 1.11.</w:t>
       </w:r>
     </w:p>
@@ -4765,37 +4870,37 @@
           <w:rFonts w:ascii="Times New Roman" w:hAnsi="Times New Roman" w:cs="Times New Roman"/>
           <w:lang w:val="tr-TR"/>
         </w:rPr>
-        <w:t xml:space="preserve">NO</w:t>
-      </w:r>
-      <w:r>
-        <w:rPr>
-          <w:rFonts w:ascii="Times New Roman" w:hAnsi="Times New Roman" w:cs="Times New Roman"/>
-          <w:lang w:val="tr-TR"/>
+        <w:t>NO</w:t>
+      </w:r>
+      <w:r>
+        <w:rPr>
+          <w:rFonts w:ascii="Times New Roman" w:hAnsi="Times New Roman" w:cs="Times New Roman"/>
           <w:vertAlign w:val="subscript"/>
-        </w:rPr>
-        <w:t xml:space="preserve">2</w:t>
-      </w:r>
-      <w:r>
-        <w:rPr>
-          <w:rFonts w:ascii="Times New Roman" w:hAnsi="Times New Roman" w:cs="Times New Roman"/>
-          <w:lang w:val="tr-TR"/>
-        </w:rPr>
-        <w:t xml:space="preserve">(g) + CO(g) → NO(g) + CO</w:t>
-      </w:r>
-      <w:r>
-        <w:rPr>
-          <w:rFonts w:ascii="Times New Roman" w:hAnsi="Times New Roman" w:cs="Times New Roman"/>
-          <w:lang w:val="tr-TR"/>
+          <w:lang w:val="tr-TR"/>
+        </w:rPr>
+        <w:t>2</w:t>
+      </w:r>
+      <w:r>
+        <w:rPr>
+          <w:rFonts w:ascii="Times New Roman" w:hAnsi="Times New Roman" w:cs="Times New Roman"/>
+          <w:lang w:val="tr-TR"/>
+        </w:rPr>
+        <w:t>(g) + CO(g) → NO(g) + CO</w:t>
+      </w:r>
+      <w:r>
+        <w:rPr>
+          <w:rFonts w:ascii="Times New Roman" w:hAnsi="Times New Roman" w:cs="Times New Roman"/>
           <w:vertAlign w:val="subscript"/>
-        </w:rPr>
-        <w:t xml:space="preserve">2</w:t>
-      </w:r>
-      <w:r>
-        <w:rPr>
-          <w:rFonts w:ascii="Times New Roman" w:hAnsi="Times New Roman" w:cs="Times New Roman"/>
-          <w:lang w:val="tr-TR"/>
-        </w:rPr>
-        <w:t xml:space="preserve">(g) tepkimesinde olduğu gibi tepkimeye giren bir maddenin derişimi tepkime hızını nasıl etkilemeyebilir? Bu sorunun cevabı, tepkimenin hangi yoldan ilerlediğinde saklıdır.</w:t>
+          <w:lang w:val="tr-TR"/>
+        </w:rPr>
+        <w:t>2</w:t>
+      </w:r>
+      <w:r>
+        <w:rPr>
+          <w:rFonts w:ascii="Times New Roman" w:hAnsi="Times New Roman" w:cs="Times New Roman"/>
+          <w:lang w:val="tr-TR"/>
+        </w:rPr>
+        <w:t>(g) tepkimesinde olduğu gibi tepkimeye giren bir maddenin derişimi tepkime hızını nasıl etkilemeyebilir? Bu sorunun cevabı, tepkimenin hangi yoldan ilerlediğinde saklıdır.</w:t>
       </w:r>
     </w:p>
     <w:p>
@@ -4843,7 +4948,15 @@
           <w:rFonts w:ascii="Times New Roman" w:hAnsi="Times New Roman" w:cs="Times New Roman"/>
           <w:lang w:val="tr-TR"/>
         </w:rPr>
-        <w:t xml:space="preserve"> denir. Basamakların denklemleri taraf tarafa toplandığında net (genel) tepkime denklemi elde edilir.</w:t>
+        <w:t xml:space="preserve"> </w:t>
+      </w:r>
+      <w:r>
+        <w:rPr>
+          <w:rFonts w:ascii="Times New Roman" w:hAnsi="Times New Roman" w:cs="Times New Roman"/>
+          <w:lang w:val="tr-TR"/>
+        </w:rPr>
+        <w:lastRenderedPageBreak/>
+        <w:t>denir. Basamakların denklemleri taraf tarafa toplandığında net (genel) tepkime denklemi elde edilir.</w:t>
       </w:r>
     </w:p>
     <w:p>
@@ -4923,37 +5036,37 @@
           <w:rFonts w:ascii="Times New Roman" w:hAnsi="Times New Roman" w:cs="Times New Roman"/>
           <w:lang w:val="tr-TR"/>
         </w:rPr>
-        <w:t xml:space="preserve">Örneğin NO</w:t>
-      </w:r>
-      <w:r>
-        <w:rPr>
-          <w:rFonts w:ascii="Times New Roman" w:hAnsi="Times New Roman" w:cs="Times New Roman"/>
-          <w:lang w:val="tr-TR"/>
+        <w:t>Örneğin NO</w:t>
+      </w:r>
+      <w:r>
+        <w:rPr>
+          <w:rFonts w:ascii="Times New Roman" w:hAnsi="Times New Roman" w:cs="Times New Roman"/>
           <w:vertAlign w:val="subscript"/>
-        </w:rPr>
-        <w:t xml:space="preserve">2</w:t>
-      </w:r>
-      <w:r>
-        <w:rPr>
-          <w:rFonts w:ascii="Times New Roman" w:hAnsi="Times New Roman" w:cs="Times New Roman"/>
-          <w:lang w:val="tr-TR"/>
-        </w:rPr>
-        <w:t xml:space="preserve">(g) + CO(g) → NO(g) + CO</w:t>
-      </w:r>
-      <w:r>
-        <w:rPr>
-          <w:rFonts w:ascii="Times New Roman" w:hAnsi="Times New Roman" w:cs="Times New Roman"/>
-          <w:lang w:val="tr-TR"/>
+          <w:lang w:val="tr-TR"/>
+        </w:rPr>
+        <w:t>2</w:t>
+      </w:r>
+      <w:r>
+        <w:rPr>
+          <w:rFonts w:ascii="Times New Roman" w:hAnsi="Times New Roman" w:cs="Times New Roman"/>
+          <w:lang w:val="tr-TR"/>
+        </w:rPr>
+        <w:t>(g) + CO(g) → NO(g) + CO</w:t>
+      </w:r>
+      <w:r>
+        <w:rPr>
+          <w:rFonts w:ascii="Times New Roman" w:hAnsi="Times New Roman" w:cs="Times New Roman"/>
           <w:vertAlign w:val="subscript"/>
-        </w:rPr>
-        <w:t xml:space="preserve">2</w:t>
-      </w:r>
-      <w:r>
-        <w:rPr>
-          <w:rFonts w:ascii="Times New Roman" w:hAnsi="Times New Roman" w:cs="Times New Roman"/>
-          <w:lang w:val="tr-TR"/>
-        </w:rPr>
-        <w:t xml:space="preserve">(g) tepkimesinin düşük sıcaklıklarda aşağıdaki iki basamakta gerçekleştiği düşünülmektedir.</w:t>
+          <w:lang w:val="tr-TR"/>
+        </w:rPr>
+        <w:t>2</w:t>
+      </w:r>
+      <w:r>
+        <w:rPr>
+          <w:rFonts w:ascii="Times New Roman" w:hAnsi="Times New Roman" w:cs="Times New Roman"/>
+          <w:lang w:val="tr-TR"/>
+        </w:rPr>
+        <w:t>(g) tepkimesinin düşük sıcaklıklarda aşağıdaki iki basamakta gerçekleştiği düşünülmektedir.</w:t>
       </w:r>
     </w:p>
     <w:p>
@@ -5030,7 +5143,6 @@
           <w:rFonts w:ascii="Times New Roman" w:hAnsi="Times New Roman" w:cs="Times New Roman"/>
           <w:lang w:val="tr-TR"/>
         </w:rPr>
-        <w:lastRenderedPageBreak/>
         <w:t>2. basamak (hızlı): NO</w:t>
       </w:r>
       <w:r>
@@ -5138,7 +5250,7 @@
           <w:rFonts w:ascii="Times New Roman" w:hAnsi="Times New Roman" w:cs="Times New Roman"/>
           <w:lang w:val="tr-TR"/>
         </w:rPr>
-        <w:t xml:space="preserve">Basamaklarda çarpışan ve oluşan taneciklerin uzay dolgu modelleri Görsel B’de verilmiştir. Birinci basamakta iki NO</w:t>
+        <w:t>Basamaklarda çarpışan ve oluşan taneciklerin uzay dolgu modelleri Görsel B’de verilmiştir. Birinci basamakta iki NO</w:t>
       </w:r>
       <w:r>
         <w:rPr>
@@ -5146,7 +5258,7 @@
           <w:vertAlign w:val="subscript"/>
           <w:lang w:val="tr-TR"/>
         </w:rPr>
-        <w:t xml:space="preserve">2</w:t>
+        <w:t>2</w:t>
       </w:r>
       <w:r>
         <w:rPr>
@@ -5161,7 +5273,7 @@
           <w:vertAlign w:val="subscript"/>
           <w:lang w:val="tr-TR"/>
         </w:rPr>
-        <w:t xml:space="preserve">3</w:t>
+        <w:t>3</w:t>
       </w:r>
       <w:r>
         <w:rPr>
@@ -5171,7 +5283,7 @@
         <w:t xml:space="preserve"> ara ürünü oksijen atomunu CO molekülüne verir.</w:t>
       </w:r>
     </w:p>
-    <w:p xmlns:a="http://schemas.openxmlformats.org/drawingml/2006/main" xmlns:pic="http://schemas.openxmlformats.org/drawingml/2006/picture">
+    <w:p>
       <w:pPr>
         <w:jc w:val="center"/>
         <w:rPr>
@@ -5180,22 +5292,26 @@
         </w:rPr>
       </w:pPr>
       <w:r>
+        <w:rPr>
+          <w:noProof/>
+        </w:rPr>
         <w:drawing>
-          <wp:inline distT="0" distB="0" distL="0" distR="0">
+          <wp:inline distT="0" distB="0" distL="0" distR="0" wp14:anchorId="49DBEF39" wp14:editId="15754436">
             <wp:extent cx="4680000" cy="2484000"/>
+            <wp:effectExtent l="0" t="0" r="0" b="0"/>
             <wp:docPr id="950169" name="Grafik 900001" descr="NO2 + CO mekanizması uzay dolgu modeli"/>
             <wp:cNvGraphicFramePr>
-              <a:graphicFrameLocks noChangeAspect="1"/>
+              <a:graphicFrameLocks xmlns:a="http://schemas.openxmlformats.org/drawingml/2006/main" noChangeAspect="1"/>
             </wp:cNvGraphicFramePr>
-            <a:graphic>
+            <a:graphic xmlns:a="http://schemas.openxmlformats.org/drawingml/2006/main">
               <a:graphicData uri="http://schemas.openxmlformats.org/drawingml/2006/picture">
-                <pic:pic>
+                <pic:pic xmlns:pic="http://schemas.openxmlformats.org/drawingml/2006/picture">
                   <pic:nvPicPr>
                     <pic:cNvPr id="950169" name="k11_900001.png"/>
                     <pic:cNvPicPr/>
                   </pic:nvPicPr>
                   <pic:blipFill>
-                    <a:blip r:embed="rIdM1"/>
+                    <a:blip r:embed="rId9"/>
                     <a:stretch>
                       <a:fillRect/>
                     </a:stretch>
@@ -5231,7 +5347,7 @@
           <w:bCs/>
           <w:lang w:val="tr-TR"/>
         </w:rPr>
-        <w:t xml:space="preserve">Görsel B:</w:t>
+        <w:t>Görsel B:</w:t>
       </w:r>
       <w:r>
         <w:rPr>
@@ -5246,14 +5362,14 @@
           <w:vertAlign w:val="subscript"/>
           <w:lang w:val="tr-TR"/>
         </w:rPr>
-        <w:t xml:space="preserve">2</w:t>
-      </w:r>
-      <w:r>
-        <w:rPr>
-          <w:rFonts w:ascii="Times New Roman" w:hAnsi="Times New Roman" w:cs="Times New Roman"/>
-          <w:lang w:val="tr-TR"/>
-        </w:rPr>
-        <w:t xml:space="preserve">(g) + CO(g) → NO(g) + CO</w:t>
+        <w:t>2</w:t>
+      </w:r>
+      <w:r>
+        <w:rPr>
+          <w:rFonts w:ascii="Times New Roman" w:hAnsi="Times New Roman" w:cs="Times New Roman"/>
+          <w:lang w:val="tr-TR"/>
+        </w:rPr>
+        <w:t>(g) + CO(g) → NO(g) + CO</w:t>
       </w:r>
       <w:r>
         <w:rPr>
@@ -5261,29 +5377,30 @@
           <w:vertAlign w:val="subscript"/>
           <w:lang w:val="tr-TR"/>
         </w:rPr>
-        <w:t xml:space="preserve">2</w:t>
-      </w:r>
-      <w:r>
-        <w:rPr>
-          <w:rFonts w:ascii="Times New Roman" w:hAnsi="Times New Roman" w:cs="Times New Roman"/>
-          <w:lang w:val="tr-TR"/>
-        </w:rPr>
-        <w:t xml:space="preserve">(g) tepkimesinin basamaklarındaki taneciklerin uzay dolgu modelleri (N: mavi, O: kırmızı, C: gri)</w:t>
-      </w:r>
-    </w:p>
-    <w:p>
-      <w:pPr>
-        <w:jc w:val="both"/>
-        <w:rPr>
-          <w:rFonts w:ascii="Times New Roman" w:hAnsi="Times New Roman" w:cs="Times New Roman"/>
-          <w:lang w:val="tr-TR"/>
-        </w:rPr>
-      </w:pPr>
-      <w:r>
-        <w:rPr>
-          <w:rFonts w:ascii="Times New Roman" w:hAnsi="Times New Roman" w:cs="Times New Roman"/>
-          <w:lang w:val="tr-TR"/>
-        </w:rPr>
+        <w:t>2</w:t>
+      </w:r>
+      <w:r>
+        <w:rPr>
+          <w:rFonts w:ascii="Times New Roman" w:hAnsi="Times New Roman" w:cs="Times New Roman"/>
+          <w:lang w:val="tr-TR"/>
+        </w:rPr>
+        <w:t>(g) tepkimesinin basamaklarındaki taneciklerin uzay dolgu modelleri (N: mavi, O: kırmızı, C: gri)</w:t>
+      </w:r>
+    </w:p>
+    <w:p>
+      <w:pPr>
+        <w:jc w:val="both"/>
+        <w:rPr>
+          <w:rFonts w:ascii="Times New Roman" w:hAnsi="Times New Roman" w:cs="Times New Roman"/>
+          <w:lang w:val="tr-TR"/>
+        </w:rPr>
+      </w:pPr>
+      <w:r>
+        <w:rPr>
+          <w:rFonts w:ascii="Times New Roman" w:hAnsi="Times New Roman" w:cs="Times New Roman"/>
+          <w:lang w:val="tr-TR"/>
+        </w:rPr>
+        <w:lastRenderedPageBreak/>
         <w:t>Birinci basamakta oluşup ikinci basamakta harcanan NO</w:t>
       </w:r>
       <w:r>
@@ -5421,7 +5538,7 @@
                     <pic:cNvPicPr/>
                   </pic:nvPicPr>
                   <pic:blipFill>
-                    <a:blip r:embed="rId8"/>
+                    <a:blip r:embed="rId10"/>
                     <a:stretch>
                       <a:fillRect/>
                     </a:stretch>
@@ -5697,7 +5814,6 @@
           <w:rFonts w:ascii="Times New Roman" w:hAnsi="Times New Roman" w:cs="Times New Roman"/>
           <w:lang w:val="tr-TR"/>
         </w:rPr>
-        <w:lastRenderedPageBreak/>
         <w:t>Buna göre net tepkime denklemini, ara ürünü, tepkimenin hız denklemini, tepkime derecesini ve hız sabitinin birimini bulunuz. NO</w:t>
       </w:r>
       <w:r>
@@ -5747,6 +5863,7 @@
           <w:rFonts w:ascii="Times New Roman" w:hAnsi="Times New Roman" w:cs="Times New Roman"/>
           <w:lang w:val="tr-TR"/>
         </w:rPr>
+        <w:lastRenderedPageBreak/>
         <w:t>Basamaklar toplanır ve iki tarafta bulunan Cl sadeleştirilir: 2NO</w:t>
       </w:r>
       <w:r>
@@ -6506,7 +6623,6 @@
                 <w:rFonts w:ascii="Times New Roman" w:hAnsi="Times New Roman" w:cs="Times New Roman"/>
                 <w:lang w:val="tr-TR"/>
               </w:rPr>
-              <w:lastRenderedPageBreak/>
               <w:t>1</w:t>
             </w:r>
           </w:p>
@@ -7270,6 +7386,7 @@
                 <w:bCs/>
                 <w:lang w:val="tr-TR"/>
               </w:rPr>
+              <w:lastRenderedPageBreak/>
               <w:t>Değişiklik</w:t>
             </w:r>
           </w:p>
@@ -7861,7 +7978,7 @@
                     <pic:cNvPicPr/>
                   </pic:nvPicPr>
                   <pic:blipFill>
-                    <a:blip r:embed="rId9"/>
+                    <a:blip r:embed="rId11"/>
                     <a:stretch>
                       <a:fillRect/>
                     </a:stretch>
@@ -8289,8 +8406,8 @@
       </w:r>
     </w:p>
     <w:sectPr>
-      <w:footerReference w:type="even" r:id="rId10"/>
-      <w:footerReference w:type="default" r:id="rId11"/>
+      <w:footerReference w:type="even" r:id="rId12"/>
+      <w:footerReference w:type="default" r:id="rId13"/>
       <w:pgSz w:w="12240" w:h="15840"/>
       <w:pgMar w:top="1440" w:right="1440" w:bottom="1440" w:left="1440" w:header="708" w:footer="708" w:gutter="0"/>
       <w:cols w:space="708"/>

</xml_diff>

<commit_message>
1.8: yeni adimlara cevap satirlari eklendi
</commit_message>
<xml_diff>
--- a/Kim11-1-8-Hiz-Denkleminin-Belirlenmesi.docx
+++ b/Kim11-1-8-Hiz-Denkleminin-Belirlenmesi.docx
@@ -1169,6 +1169,42 @@
     </w:p>
     <w:p>
       <w:pPr>
+        <w:ind w:left="720"/>
+        <w:jc w:val="both"/>
+        <w:rPr>
+          <w:rFonts w:ascii="Times New Roman" w:hAnsi="Times New Roman" w:cs="Times New Roman"/>
+          <w:lang w:val="tr-TR"/>
+        </w:rPr>
+      </w:pPr>
+      <w:r>
+        <w:rPr>
+          <w:rFonts w:ascii="Times New Roman" w:hAnsi="Times New Roman" w:cs="Times New Roman"/>
+          <w:lang w:val="tr-TR"/>
+        </w:rPr>
+        <w:lastRenderedPageBreak/>
+        <w:t>……………………………………………………………………………………………</w:t>
+      </w:r>
+    </w:p>
+    <w:p>
+      <w:pPr>
+        <w:ind w:left="720"/>
+        <w:jc w:val="both"/>
+        <w:rPr>
+          <w:rFonts w:ascii="Times New Roman" w:hAnsi="Times New Roman" w:cs="Times New Roman"/>
+          <w:lang w:val="tr-TR"/>
+        </w:rPr>
+      </w:pPr>
+      <w:r>
+        <w:rPr>
+          <w:rFonts w:ascii="Times New Roman" w:hAnsi="Times New Roman" w:cs="Times New Roman"/>
+          <w:lang w:val="tr-TR"/>
+        </w:rPr>
+        <w:lastRenderedPageBreak/>
+        <w:t>……………………………………………………………………………………………</w:t>
+      </w:r>
+    </w:p>
+    <w:p>
+      <w:pPr>
         <w:pStyle w:val="ListParagraph"/>
         <w:numPr>
           <w:ilvl w:val="0"/>
@@ -1201,6 +1237,42 @@
           <w:lang w:val="tr-TR"/>
         </w:rPr>
         <w:t xml:space="preserve"> derişiminin hangi kuvvetleriyle doğru orantılıdır? Tepkime hızının iki tepkenin derişimine birlikte bağlılığını bir orantı olarak yazınız (r ∝ …).</w:t>
+      </w:r>
+    </w:p>
+    <w:p>
+      <w:pPr>
+        <w:ind w:left="720"/>
+        <w:jc w:val="both"/>
+        <w:rPr>
+          <w:rFonts w:ascii="Times New Roman" w:hAnsi="Times New Roman" w:cs="Times New Roman"/>
+          <w:lang w:val="tr-TR"/>
+        </w:rPr>
+      </w:pPr>
+      <w:r>
+        <w:rPr>
+          <w:rFonts w:ascii="Times New Roman" w:hAnsi="Times New Roman" w:cs="Times New Roman"/>
+          <w:lang w:val="tr-TR"/>
+        </w:rPr>
+        <w:lastRenderedPageBreak/>
+        <w:t>……………………………………………………………………………………………</w:t>
+      </w:r>
+    </w:p>
+    <w:p>
+      <w:pPr>
+        <w:ind w:left="720"/>
+        <w:jc w:val="both"/>
+        <w:rPr>
+          <w:rFonts w:ascii="Times New Roman" w:hAnsi="Times New Roman" w:cs="Times New Roman"/>
+          <w:lang w:val="tr-TR"/>
+        </w:rPr>
+      </w:pPr>
+      <w:r>
+        <w:rPr>
+          <w:rFonts w:ascii="Times New Roman" w:hAnsi="Times New Roman" w:cs="Times New Roman"/>
+          <w:lang w:val="tr-TR"/>
+        </w:rPr>
+        <w:lastRenderedPageBreak/>
+        <w:t>……………………………………………………………………………………………</w:t>
       </w:r>
     </w:p>
     <w:p>

</xml_diff>

<commit_message>
1.8: karekod etiketi dijital icerikle uyumlu hale getirildi (calisma kagidi)
</commit_message>
<xml_diff>
--- a/Kim11-1-8-Hiz-Denkleminin-Belirlenmesi.docx
+++ b/Kim11-1-8-Hiz-Denkleminin-Belirlenmesi.docx
@@ -8356,7 +8356,7 @@
           <w:rFonts w:ascii="Times New Roman" w:hAnsi="Times New Roman" w:cs="Times New Roman"/>
           <w:lang w:val="tr-TR"/>
         </w:rPr>
-        <w:t>Tepken derişimlerini değiştirerek tepkimelerin hız denklemini, hız sabitini ve derecesini belirleyebileceğiniz sanal laboratuvar uygulamasına ulaşmak için karekodu okutunuz.</w:t>
+        <w:t xml:space="preserve">Tepken derişimlerini değiştirerek tepkimelerin hız denklemini, hız sabitini ve derecesini belirleyebileceğiniz çalışma kâğıdına ulaşmak için karekodu okutunuz.</w:t>
       </w:r>
     </w:p>
     <w:p>
@@ -8427,7 +8427,7 @@
                               <w:rPr>
                                 <w:lang w:val="tr-TR"/>
                               </w:rPr>
-                              <w:t>Karekod alanı: Sanal laboratuvar (Kim11.1.8)</w:t>
+                              <w:t>Karekod alanı: Çalışma kâğıdı (Kim11.1.8)</w:t>
                             </w:r>
                           </w:p>
                         </w:txbxContent>
@@ -8466,7 +8466,7 @@
                         <w:rPr>
                           <w:lang w:val="tr-TR"/>
                         </w:rPr>
-                        <w:t>Karekod alanı: Sanal laboratuvar (Kim11.1.8)</w:t>
+                        <w:t>Karekod alanı: Çalışma kâğıdı (Kim11.1.8)</w:t>
                       </w:r>
                     </w:p>
                   </w:txbxContent>

</xml_diff>